<commit_message>
revised 02/2026 templates and schema doc
</commit_message>
<xml_diff>
--- a/tmpl_gen/docs/CTI-DB-Schema-details.docx
+++ b/tmpl_gen/docs/CTI-DB-Schema-details.docx
@@ -152,7 +152,7 @@
                 <w:tab w:val="left" w:pos="725" w:leader="none"/>
               </w:tabs>
               <w:suppressAutoHyphens w:val="true"/>
-              <w:overflowPunct w:val="false"/>
+              <w:overflowPunct w:val="true"/>
               <w:bidi w:val="0"/>
               <w:snapToGrid w:val="false"/>
               <w:spacing w:lineRule="auto" w:line="240"/>
@@ -210,7 +210,7 @@
                 <w:tab w:val="left" w:pos="725" w:leader="none"/>
               </w:tabs>
               <w:suppressAutoHyphens w:val="true"/>
-              <w:overflowPunct w:val="false"/>
+              <w:overflowPunct w:val="true"/>
               <w:bidi w:val="0"/>
               <w:snapToGrid w:val="false"/>
               <w:spacing w:lineRule="auto" w:line="240"/>
@@ -268,7 +268,7 @@
                 <w:tab w:val="left" w:pos="725" w:leader="none"/>
               </w:tabs>
               <w:suppressAutoHyphens w:val="true"/>
-              <w:overflowPunct w:val="false"/>
+              <w:overflowPunct w:val="true"/>
               <w:bidi w:val="0"/>
               <w:snapToGrid w:val="false"/>
               <w:spacing w:lineRule="auto" w:line="240"/>
@@ -326,7 +326,7 @@
                 <w:tab w:val="left" w:pos="725" w:leader="none"/>
               </w:tabs>
               <w:suppressAutoHyphens w:val="true"/>
-              <w:overflowPunct w:val="false"/>
+              <w:overflowPunct w:val="true"/>
               <w:bidi w:val="0"/>
               <w:snapToGrid w:val="false"/>
               <w:spacing w:lineRule="auto" w:line="240"/>
@@ -384,7 +384,7 @@
                 <w:tab w:val="left" w:pos="725" w:leader="none"/>
               </w:tabs>
               <w:suppressAutoHyphens w:val="true"/>
-              <w:overflowPunct w:val="false"/>
+              <w:overflowPunct w:val="true"/>
               <w:bidi w:val="0"/>
               <w:snapToGrid w:val="false"/>
               <w:spacing w:lineRule="auto" w:line="240"/>
@@ -442,7 +442,7 @@
                 <w:tab w:val="left" w:pos="725" w:leader="none"/>
               </w:tabs>
               <w:suppressAutoHyphens w:val="true"/>
-              <w:overflowPunct w:val="false"/>
+              <w:overflowPunct w:val="true"/>
               <w:bidi w:val="0"/>
               <w:snapToGrid w:val="false"/>
               <w:spacing w:lineRule="auto" w:line="240"/>
@@ -500,7 +500,7 @@
                 <w:tab w:val="left" w:pos="725" w:leader="none"/>
               </w:tabs>
               <w:suppressAutoHyphens w:val="true"/>
-              <w:overflowPunct w:val="false"/>
+              <w:overflowPunct w:val="true"/>
               <w:bidi w:val="0"/>
               <w:snapToGrid w:val="false"/>
               <w:spacing w:lineRule="auto" w:line="240"/>
@@ -558,7 +558,7 @@
                 <w:tab w:val="left" w:pos="725" w:leader="none"/>
               </w:tabs>
               <w:suppressAutoHyphens w:val="true"/>
-              <w:overflowPunct w:val="false"/>
+              <w:overflowPunct w:val="true"/>
               <w:bidi w:val="0"/>
               <w:snapToGrid w:val="false"/>
               <w:spacing w:lineRule="auto" w:line="240"/>
@@ -616,7 +616,7 @@
                 <w:tab w:val="left" w:pos="725" w:leader="none"/>
               </w:tabs>
               <w:suppressAutoHyphens w:val="true"/>
-              <w:overflowPunct w:val="false"/>
+              <w:overflowPunct w:val="true"/>
               <w:bidi w:val="0"/>
               <w:snapToGrid w:val="false"/>
               <w:spacing w:lineRule="auto" w:line="240"/>
@@ -674,7 +674,7 @@
                 <w:tab w:val="left" w:pos="725" w:leader="none"/>
               </w:tabs>
               <w:suppressAutoHyphens w:val="true"/>
-              <w:overflowPunct w:val="false"/>
+              <w:overflowPunct w:val="true"/>
               <w:bidi w:val="0"/>
               <w:snapToGrid w:val="false"/>
               <w:spacing w:lineRule="auto" w:line="240"/>
@@ -732,7 +732,7 @@
                 <w:tab w:val="left" w:pos="725" w:leader="none"/>
               </w:tabs>
               <w:suppressAutoHyphens w:val="true"/>
-              <w:overflowPunct w:val="false"/>
+              <w:overflowPunct w:val="true"/>
               <w:bidi w:val="0"/>
               <w:snapToGrid w:val="false"/>
               <w:spacing w:lineRule="auto" w:line="240"/>
@@ -790,7 +790,7 @@
                 <w:tab w:val="left" w:pos="725" w:leader="none"/>
               </w:tabs>
               <w:suppressAutoHyphens w:val="true"/>
-              <w:overflowPunct w:val="false"/>
+              <w:overflowPunct w:val="true"/>
               <w:bidi w:val="0"/>
               <w:snapToGrid w:val="false"/>
               <w:spacing w:lineRule="auto" w:line="240"/>
@@ -848,7 +848,7 @@
                 <w:tab w:val="left" w:pos="725" w:leader="none"/>
               </w:tabs>
               <w:suppressAutoHyphens w:val="true"/>
-              <w:overflowPunct w:val="false"/>
+              <w:overflowPunct w:val="true"/>
               <w:bidi w:val="0"/>
               <w:snapToGrid w:val="false"/>
               <w:spacing w:lineRule="auto" w:line="240"/>
@@ -906,7 +906,7 @@
                 <w:tab w:val="left" w:pos="725" w:leader="none"/>
               </w:tabs>
               <w:suppressAutoHyphens w:val="true"/>
-              <w:overflowPunct w:val="false"/>
+              <w:overflowPunct w:val="true"/>
               <w:bidi w:val="0"/>
               <w:snapToGrid w:val="false"/>
               <w:spacing w:lineRule="auto" w:line="240"/>
@@ -964,7 +964,7 @@
                 <w:tab w:val="left" w:pos="725" w:leader="none"/>
               </w:tabs>
               <w:suppressAutoHyphens w:val="true"/>
-              <w:overflowPunct w:val="false"/>
+              <w:overflowPunct w:val="true"/>
               <w:bidi w:val="0"/>
               <w:snapToGrid w:val="false"/>
               <w:spacing w:lineRule="auto" w:line="240"/>
@@ -1022,7 +1022,7 @@
                 <w:tab w:val="left" w:pos="725" w:leader="none"/>
               </w:tabs>
               <w:suppressAutoHyphens w:val="true"/>
-              <w:overflowPunct w:val="false"/>
+              <w:overflowPunct w:val="true"/>
               <w:bidi w:val="0"/>
               <w:snapToGrid w:val="false"/>
               <w:spacing w:lineRule="auto" w:line="240"/>
@@ -1461,7 +1461,7 @@
                 <w:tab w:val="left" w:pos="725" w:leader="none"/>
               </w:tabs>
               <w:suppressAutoHyphens w:val="true"/>
-              <w:overflowPunct w:val="false"/>
+              <w:overflowPunct w:val="true"/>
               <w:bidi w:val="0"/>
               <w:snapToGrid w:val="false"/>
               <w:spacing w:lineRule="auto" w:line="240"/>
@@ -1565,7 +1565,7 @@
                 <w:tab w:val="left" w:pos="725" w:leader="none"/>
               </w:tabs>
               <w:suppressAutoHyphens w:val="true"/>
-              <w:overflowPunct w:val="false"/>
+              <w:overflowPunct w:val="true"/>
               <w:bidi w:val="0"/>
               <w:snapToGrid w:val="false"/>
               <w:spacing w:lineRule="auto" w:line="240"/>
@@ -1580,6 +1580,94 @@
           </w:p>
         </w:tc>
       </w:tr>
+      <w:tr>
+        <w:trPr/>
+        <w:tc>
+          <w:tcPr>
+            <w:tcW w:w="1141" w:type="dxa"/>
+            <w:tcBorders>
+              <w:start w:val="single" w:sz="4" w:space="0" w:color="000000"/>
+              <w:bottom w:val="single" w:sz="4" w:space="0" w:color="000000"/>
+            </w:tcBorders>
+          </w:tcPr>
+          <w:p>
+            <w:pPr>
+              <w:pStyle w:val="TableContents"/>
+              <w:snapToGrid w:val="false"/>
+              <w:jc w:val="start"/>
+              <w:rPr>
+                <w:rFonts w:cs="Liberation Serif;Times New Roman"/>
+                <w:b w:val="false"/>
+                <w:bCs w:val="false"/>
+                <w:i w:val="false"/>
+                <w:i w:val="false"/>
+                <w:iCs w:val="false"/>
+                <w:strike w:val="false"/>
+                <w:dstrike w:val="false"/>
+                <w:outline w:val="false"/>
+                <w:shadow w:val="false"/>
+                <w:color w:val="000000"/>
+                <w:sz w:val="24"/>
+                <w:szCs w:val="24"/>
+                <w:u w:val="none"/>
+              </w:rPr>
+            </w:pPr>
+            <w:r>
+              <w:rPr>
+                <w:rFonts w:cs="Liberation Serif;Times New Roman"/>
+                <w:b w:val="false"/>
+                <w:bCs w:val="false"/>
+                <w:i w:val="false"/>
+                <w:iCs w:val="false"/>
+                <w:strike w:val="false"/>
+                <w:dstrike w:val="false"/>
+                <w:outline w:val="false"/>
+                <w:shadow w:val="false"/>
+                <w:color w:val="000000"/>
+                <w:sz w:val="24"/>
+                <w:szCs w:val="24"/>
+                <w:u w:val="none"/>
+              </w:rPr>
+              <w:t>3/19/2023</w:t>
+            </w:r>
+          </w:p>
+        </w:tc>
+        <w:tc>
+          <w:tcPr>
+            <w:tcW w:w="8496" w:type="dxa"/>
+            <w:tcBorders>
+              <w:start w:val="single" w:sz="4" w:space="0" w:color="000000"/>
+              <w:bottom w:val="single" w:sz="4" w:space="0" w:color="000000"/>
+              <w:end w:val="single" w:sz="4" w:space="0" w:color="000000"/>
+            </w:tcBorders>
+          </w:tcPr>
+          <w:p>
+            <w:pPr>
+              <w:pStyle w:val="TableContents"/>
+              <w:numPr>
+                <w:ilvl w:val="0"/>
+                <w:numId w:val="2"/>
+              </w:numPr>
+              <w:tabs>
+                <w:tab w:val="clear" w:pos="709"/>
+                <w:tab w:val="left" w:pos="725" w:leader="none"/>
+              </w:tabs>
+              <w:suppressAutoHyphens w:val="true"/>
+              <w:overflowPunct w:val="true"/>
+              <w:bidi w:val="0"/>
+              <w:snapToGrid w:val="false"/>
+              <w:spacing w:lineRule="auto" w:line="240"/>
+              <w:ind w:hanging="0" w:start="0" w:end="0"/>
+              <w:jc w:val="start"/>
+              <w:rPr/>
+            </w:pPr>
+            <w:r>
+              <w:rPr/>
+              <w:t>CAPEC node: abstraction property to the summary</w:t>
+            </w:r>
+          </w:p>
+        </w:tc>
+      </w:tr>
     </w:tbl>
     <w:p>
       <w:pPr>
@@ -4079,7 +4167,7 @@
         <w:pStyle w:val="BodyText"/>
         <w:widowControl/>
         <w:suppressAutoHyphens w:val="true"/>
-        <w:overflowPunct w:val="false"/>
+        <w:overflowPunct w:val="true"/>
         <w:bidi w:val="0"/>
         <w:rPr/>
       </w:pPr>
@@ -4100,7 +4188,7 @@
         <w:pStyle w:val="BodyText"/>
         <w:widowControl/>
         <w:suppressAutoHyphens w:val="true"/>
-        <w:overflowPunct w:val="false"/>
+        <w:overflowPunct w:val="true"/>
         <w:bidi w:val="0"/>
         <w:rPr/>
       </w:pPr>
@@ -4133,7 +4221,7 @@
         <w:pStyle w:val="BodyText"/>
         <w:widowControl/>
         <w:suppressAutoHyphens w:val="true"/>
-        <w:overflowPunct w:val="false"/>
+        <w:overflowPunct w:val="true"/>
         <w:bidi w:val="0"/>
         <w:rPr>
           <w:rFonts w:ascii="Liberation Serif;Times New Roman" w:hAnsi="Liberation Serif;Times New Roman" w:eastAsia="Noto Serif CJK SC" w:cs="Noto Sans Devanagari"/>
@@ -4161,7 +4249,7 @@
         <w:pStyle w:val="BodyText"/>
         <w:widowControl/>
         <w:suppressAutoHyphens w:val="true"/>
-        <w:overflowPunct w:val="false"/>
+        <w:overflowPunct w:val="true"/>
         <w:bidi w:val="0"/>
         <w:rPr>
           <w:rFonts w:ascii="Liberation Serif;Times New Roman" w:hAnsi="Liberation Serif;Times New Roman" w:eastAsia="Noto Serif CJK SC" w:cs="Noto Sans Devanagari"/>
@@ -4911,7 +4999,7 @@
         <w:pStyle w:val="BodyText"/>
         <w:widowControl/>
         <w:suppressAutoHyphens w:val="true"/>
-        <w:overflowPunct w:val="false"/>
+        <w:overflowPunct w:val="true"/>
         <w:bidi w:val="0"/>
         <w:spacing w:lineRule="auto" w:line="240" w:before="0" w:after="0"/>
         <w:jc w:val="start"/>
@@ -5959,7 +6047,7 @@
         <w:pStyle w:val="BodyText"/>
         <w:widowControl/>
         <w:suppressAutoHyphens w:val="true"/>
-        <w:overflowPunct w:val="false"/>
+        <w:overflowPunct w:val="true"/>
         <w:bidi w:val="0"/>
         <w:spacing w:lineRule="auto" w:line="240" w:before="0" w:after="0"/>
         <w:jc w:val="start"/>
@@ -6004,7 +6092,7 @@
         <w:pStyle w:val="BodyText"/>
         <w:widowControl/>
         <w:suppressAutoHyphens w:val="true"/>
-        <w:overflowPunct w:val="false"/>
+        <w:overflowPunct w:val="true"/>
         <w:bidi w:val="0"/>
         <w:spacing w:lineRule="auto" w:line="240" w:before="0" w:after="0"/>
         <w:jc w:val="start"/>
@@ -6045,7 +6133,7 @@
         <w:pStyle w:val="BodyText"/>
         <w:widowControl/>
         <w:suppressAutoHyphens w:val="true"/>
-        <w:overflowPunct w:val="false"/>
+        <w:overflowPunct w:val="true"/>
         <w:bidi w:val="0"/>
         <w:spacing w:lineRule="auto" w:line="240" w:before="0" w:after="0"/>
         <w:jc w:val="start"/>
@@ -6093,7 +6181,7 @@
         <w:pStyle w:val="BodyText"/>
         <w:widowControl/>
         <w:suppressAutoHyphens w:val="true"/>
-        <w:overflowPunct w:val="false"/>
+        <w:overflowPunct w:val="true"/>
         <w:bidi w:val="0"/>
         <w:spacing w:lineRule="auto" w:line="240" w:before="0" w:after="0"/>
         <w:jc w:val="start"/>
@@ -10848,25 +10936,33 @@
       </w:pPr>
       <w:r>
         <w:rPr>
-          <w:shd w:fill="auto" w:val="clear"/>
-        </w:rPr>
-      </w:r>
-    </w:p>
-    <w:p>
-      <w:pPr>
-        <w:pStyle w:val="Normal"/>
-        <w:jc w:val="start"/>
-        <w:rPr>
-          <w:rFonts w:ascii="DejaVu Sans Mono" w:hAnsi="DejaVu Sans Mono" w:cs="DejaVu Sans Mono"/>
+          <w:rFonts w:cs="DejaVu Sans Mono" w:ascii="DejaVu Sans Mono" w:hAnsi="DejaVu Sans Mono"/>
           <w:b w:val="false"/>
           <w:bCs w:val="false"/>
           <w:sz w:val="18"/>
           <w:szCs w:val="18"/>
         </w:rPr>
-      </w:pPr>
-      <w:r>
-        <w:rPr>
-          <w:shd w:fill="auto" w:val="clear"/>
+      </w:r>
+    </w:p>
+    <w:p>
+      <w:pPr>
+        <w:pStyle w:val="Normal"/>
+        <w:jc w:val="start"/>
+        <w:rPr>
+          <w:rFonts w:ascii="DejaVu Sans Mono" w:hAnsi="DejaVu Sans Mono" w:cs="DejaVu Sans Mono"/>
+          <w:b w:val="false"/>
+          <w:bCs w:val="false"/>
+          <w:sz w:val="18"/>
+          <w:szCs w:val="18"/>
+        </w:rPr>
+      </w:pPr>
+      <w:r>
+        <w:rPr>
+          <w:rFonts w:cs="DejaVu Sans Mono" w:ascii="DejaVu Sans Mono" w:hAnsi="DejaVu Sans Mono"/>
+          <w:b w:val="false"/>
+          <w:bCs w:val="false"/>
+          <w:sz w:val="18"/>
+          <w:szCs w:val="18"/>
         </w:rPr>
       </w:r>
     </w:p>
@@ -11284,10 +11380,24 @@
           <w:szCs w:val="18"/>
           <w:shd w:fill="auto" w:val="clear"/>
         </w:rPr>
-        <w:t xml:space="preserve">.../@Abstraction </w:t>
-        <w:tab/>
-        <w:tab/>
-        <w:tab/>
+        <w:t xml:space="preserve">.../@Abstraction → rename to </w:t>
+      </w:r>
+      <w:r>
+        <w:rPr>
+          <w:rFonts w:cs="DejaVu Sans Mono" w:ascii="DejaVu Sans Mono" w:hAnsi="DejaVu Sans Mono"/>
+          <w:sz w:val="18"/>
+          <w:szCs w:val="18"/>
+          <w:shd w:fill="auto" w:val="clear"/>
+        </w:rPr>
+        <w:t>abstraction</w:t>
+      </w:r>
+      <w:r>
+        <w:rPr>
+          <w:rFonts w:cs="DejaVu Sans Mono" w:ascii="DejaVu Sans Mono" w:hAnsi="DejaVu Sans Mono"/>
+          <w:sz w:val="18"/>
+          <w:szCs w:val="18"/>
+          <w:shd w:fill="auto" w:val="clear"/>
+        </w:rPr>
         <w:tab/>
         <w:t>string, “Detailed” or “Standard” or “Meta”</w:t>
       </w:r>
@@ -12524,6 +12634,17 @@
           <w:szCs w:val="18"/>
         </w:rPr>
       </w:pPr>
+      <w:r>
+        <w:rPr>
+          <w:rFonts w:cs="DejaVu Sans Mono" w:ascii="DejaVu Sans Mono" w:hAnsi="DejaVu Sans Mono"/>
+          <w:b w:val="false"/>
+          <w:bCs w:val="false"/>
+          <w:sz w:val="18"/>
+          <w:szCs w:val="18"/>
+          <w:shd w:fill="auto" w:val="clear"/>
+        </w:rPr>
+        <w:t xml:space="preserve">abstraction, </w:t>
+      </w:r>
       <w:r>
         <w:rPr>
           <w:rFonts w:cs="DejaVu Sans Mono" w:ascii="DejaVu Sans Mono" w:hAnsi="DejaVu Sans Mono"/>
@@ -14318,7 +14439,7 @@
         <w:pStyle w:val="BodyText"/>
         <w:widowControl/>
         <w:suppressAutoHyphens w:val="true"/>
-        <w:overflowPunct w:val="false"/>
+        <w:overflowPunct w:val="true"/>
         <w:bidi w:val="0"/>
         <w:spacing w:lineRule="auto" w:line="240" w:before="0" w:after="0"/>
         <w:ind w:end="-89"/>
@@ -14349,7 +14470,7 @@
         <w:pStyle w:val="BodyText"/>
         <w:widowControl/>
         <w:suppressAutoHyphens w:val="true"/>
-        <w:overflowPunct w:val="false"/>
+        <w:overflowPunct w:val="true"/>
         <w:bidi w:val="0"/>
         <w:spacing w:lineRule="auto" w:line="240" w:before="0" w:after="0"/>
         <w:ind w:end="-89"/>
@@ -14385,7 +14506,7 @@
         <w:pStyle w:val="BodyText"/>
         <w:widowControl/>
         <w:suppressAutoHyphens w:val="true"/>
-        <w:overflowPunct w:val="false"/>
+        <w:overflowPunct w:val="true"/>
         <w:bidi w:val="0"/>
         <w:spacing w:lineRule="auto" w:line="240" w:before="0" w:after="0"/>
         <w:ind w:end="-89"/>
@@ -14420,7 +14541,7 @@
         <w:pStyle w:val="BodyText"/>
         <w:widowControl/>
         <w:suppressAutoHyphens w:val="true"/>
-        <w:overflowPunct w:val="false"/>
+        <w:overflowPunct w:val="true"/>
         <w:bidi w:val="0"/>
         <w:spacing w:lineRule="auto" w:line="240" w:before="0" w:after="0"/>
         <w:ind w:end="-89"/>
@@ -14456,7 +14577,7 @@
         <w:pStyle w:val="BodyText"/>
         <w:widowControl/>
         <w:suppressAutoHyphens w:val="true"/>
-        <w:overflowPunct w:val="false"/>
+        <w:overflowPunct w:val="true"/>
         <w:bidi w:val="0"/>
         <w:spacing w:lineRule="auto" w:line="240" w:before="0" w:after="0"/>
         <w:ind w:end="-89"/>
@@ -14490,7 +14611,7 @@
         <w:pStyle w:val="BodyText"/>
         <w:widowControl/>
         <w:suppressAutoHyphens w:val="true"/>
-        <w:overflowPunct w:val="false"/>
+        <w:overflowPunct w:val="true"/>
         <w:bidi w:val="0"/>
         <w:spacing w:lineRule="auto" w:line="240" w:before="0" w:after="0"/>
         <w:ind w:end="-89"/>
@@ -14526,7 +14647,7 @@
         <w:pStyle w:val="BodyText"/>
         <w:widowControl/>
         <w:suppressAutoHyphens w:val="true"/>
-        <w:overflowPunct w:val="false"/>
+        <w:overflowPunct w:val="true"/>
         <w:bidi w:val="0"/>
         <w:spacing w:lineRule="auto" w:line="240" w:before="0" w:after="0"/>
         <w:ind w:end="-89"/>
@@ -14561,7 +14682,7 @@
         <w:pStyle w:val="BodyText"/>
         <w:widowControl/>
         <w:suppressAutoHyphens w:val="true"/>
-        <w:overflowPunct w:val="false"/>
+        <w:overflowPunct w:val="true"/>
         <w:bidi w:val="0"/>
         <w:spacing w:lineRule="auto" w:line="240" w:before="0" w:after="0"/>
         <w:ind w:end="-89"/>
@@ -14596,7 +14717,7 @@
         <w:pStyle w:val="BodyText"/>
         <w:widowControl/>
         <w:suppressAutoHyphens w:val="true"/>
-        <w:overflowPunct w:val="false"/>
+        <w:overflowPunct w:val="true"/>
         <w:bidi w:val="0"/>
         <w:spacing w:lineRule="auto" w:line="240" w:before="0" w:after="0"/>
         <w:ind w:end="-89"/>
@@ -14632,7 +14753,7 @@
         <w:pStyle w:val="BodyText"/>
         <w:widowControl/>
         <w:suppressAutoHyphens w:val="true"/>
-        <w:overflowPunct w:val="false"/>
+        <w:overflowPunct w:val="true"/>
         <w:bidi w:val="0"/>
         <w:spacing w:lineRule="auto" w:line="240" w:before="0" w:after="0"/>
         <w:ind w:end="-89"/>
@@ -14665,7 +14786,7 @@
         <w:pStyle w:val="BodyText"/>
         <w:widowControl/>
         <w:suppressAutoHyphens w:val="true"/>
-        <w:overflowPunct w:val="false"/>
+        <w:overflowPunct w:val="true"/>
         <w:bidi w:val="0"/>
         <w:spacing w:lineRule="auto" w:line="240" w:before="0" w:after="0"/>
         <w:ind w:end="-89"/>
@@ -14701,7 +14822,7 @@
         <w:pStyle w:val="BodyText"/>
         <w:widowControl/>
         <w:suppressAutoHyphens w:val="true"/>
-        <w:overflowPunct w:val="false"/>
+        <w:overflowPunct w:val="true"/>
         <w:bidi w:val="0"/>
         <w:spacing w:lineRule="auto" w:line="240" w:before="0" w:after="0"/>
         <w:ind w:end="-89"/>
@@ -14737,7 +14858,7 @@
         <w:pStyle w:val="BodyText"/>
         <w:widowControl/>
         <w:suppressAutoHyphens w:val="true"/>
-        <w:overflowPunct w:val="false"/>
+        <w:overflowPunct w:val="true"/>
         <w:bidi w:val="0"/>
         <w:spacing w:lineRule="auto" w:line="240" w:before="0" w:after="0"/>
         <w:ind w:end="-89"/>
@@ -14803,7 +14924,7 @@
         <w:pStyle w:val="BodyText"/>
         <w:widowControl/>
         <w:suppressAutoHyphens w:val="true"/>
-        <w:overflowPunct w:val="false"/>
+        <w:overflowPunct w:val="true"/>
         <w:bidi w:val="0"/>
         <w:spacing w:lineRule="auto" w:line="240" w:before="0" w:after="0"/>
         <w:ind w:end="-89"/>
@@ -14855,7 +14976,7 @@
         <w:pStyle w:val="BodyText"/>
         <w:widowControl/>
         <w:suppressAutoHyphens w:val="true"/>
-        <w:overflowPunct w:val="false"/>
+        <w:overflowPunct w:val="true"/>
         <w:bidi w:val="0"/>
         <w:spacing w:lineRule="auto" w:line="240" w:before="0" w:after="0"/>
         <w:ind w:end="-89"/>
@@ -14889,7 +15010,7 @@
         <w:pStyle w:val="BodyText"/>
         <w:widowControl/>
         <w:suppressAutoHyphens w:val="true"/>
-        <w:overflowPunct w:val="false"/>
+        <w:overflowPunct w:val="true"/>
         <w:bidi w:val="0"/>
         <w:spacing w:lineRule="auto" w:line="240" w:before="0" w:after="0"/>
         <w:ind w:end="-89"/>
@@ -14967,7 +15088,7 @@
   <w:comment w:id="0" w:author="I.C." w:date="2026-02-20T20:32:28Z" w:initials="I">
     <w:p>
       <w:pPr>
-        <w:overflowPunct w:val="true"/>
+        <w:overflowPunct w:val="false"/>
         <w:rPr/>
       </w:pPr>
       <w:r>
@@ -14981,7 +15102,7 @@
     </w:p>
     <w:p>
       <w:pPr>
-        <w:overflowPunct w:val="true"/>
+        <w:overflowPunct w:val="false"/>
         <w:rPr/>
       </w:pPr>
       <w:r>
@@ -15418,7 +15539,7 @@
     <w:pPr>
       <w:widowControl/>
       <w:suppressAutoHyphens w:val="true"/>
-      <w:overflowPunct w:val="false"/>
+      <w:overflowPunct w:val="true"/>
       <w:bidi w:val="0"/>
       <w:spacing w:before="0" w:after="0"/>
       <w:jc w:val="start"/>

</xml_diff>

<commit_message>
added EPSS to schema doc and xls summary
</commit_message>
<xml_diff>
--- a/tmpl_gen/docs/CTI-DB-Schema-details.docx
+++ b/tmpl_gen/docs/CTI-DB-Schema-details.docx
@@ -1663,7 +1663,103 @@
             </w:pPr>
             <w:r>
               <w:rPr/>
-              <w:t>CAPEC node: abstraction property to the summary</w:t>
+              <w:t xml:space="preserve">CAPEC node: </w:t>
+            </w:r>
+            <w:r>
+              <w:rPr/>
+              <w:t xml:space="preserve">added </w:t>
+            </w:r>
+            <w:r>
+              <w:rPr/>
+              <w:t>abstraction property to the summary</w:t>
+            </w:r>
+          </w:p>
+        </w:tc>
+      </w:tr>
+      <w:tr>
+        <w:trPr/>
+        <w:tc>
+          <w:tcPr>
+            <w:tcW w:w="1141" w:type="dxa"/>
+            <w:tcBorders>
+              <w:start w:val="single" w:sz="4" w:space="0" w:color="000000"/>
+              <w:bottom w:val="single" w:sz="4" w:space="0" w:color="000000"/>
+            </w:tcBorders>
+          </w:tcPr>
+          <w:p>
+            <w:pPr>
+              <w:pStyle w:val="TableContents"/>
+              <w:snapToGrid w:val="false"/>
+              <w:jc w:val="start"/>
+              <w:rPr>
+                <w:rFonts w:cs="Liberation Serif;Times New Roman"/>
+                <w:b w:val="false"/>
+                <w:bCs w:val="false"/>
+                <w:i w:val="false"/>
+                <w:i w:val="false"/>
+                <w:iCs w:val="false"/>
+                <w:strike w:val="false"/>
+                <w:dstrike w:val="false"/>
+                <w:outline w:val="false"/>
+                <w:shadow w:val="false"/>
+                <w:color w:val="000000"/>
+                <w:sz w:val="24"/>
+                <w:szCs w:val="24"/>
+                <w:u w:val="none"/>
+              </w:rPr>
+            </w:pPr>
+            <w:r>
+              <w:rPr>
+                <w:rFonts w:cs="Liberation Serif;Times New Roman"/>
+                <w:b w:val="false"/>
+                <w:bCs w:val="false"/>
+                <w:i w:val="false"/>
+                <w:iCs w:val="false"/>
+                <w:strike w:val="false"/>
+                <w:dstrike w:val="false"/>
+                <w:outline w:val="false"/>
+                <w:shadow w:val="false"/>
+                <w:color w:val="000000"/>
+                <w:sz w:val="24"/>
+                <w:szCs w:val="24"/>
+                <w:u w:val="none"/>
+              </w:rPr>
+              <w:t>3/20/2023</w:t>
+            </w:r>
+          </w:p>
+        </w:tc>
+        <w:tc>
+          <w:tcPr>
+            <w:tcW w:w="8496" w:type="dxa"/>
+            <w:tcBorders>
+              <w:start w:val="single" w:sz="4" w:space="0" w:color="000000"/>
+              <w:bottom w:val="single" w:sz="4" w:space="0" w:color="000000"/>
+              <w:end w:val="single" w:sz="4" w:space="0" w:color="000000"/>
+            </w:tcBorders>
+          </w:tcPr>
+          <w:p>
+            <w:pPr>
+              <w:pStyle w:val="TableContents"/>
+              <w:numPr>
+                <w:ilvl w:val="0"/>
+                <w:numId w:val="2"/>
+              </w:numPr>
+              <w:tabs>
+                <w:tab w:val="clear" w:pos="709"/>
+                <w:tab w:val="left" w:pos="725" w:leader="none"/>
+              </w:tabs>
+              <w:suppressAutoHyphens w:val="true"/>
+              <w:overflowPunct w:val="true"/>
+              <w:bidi w:val="0"/>
+              <w:snapToGrid w:val="false"/>
+              <w:spacing w:lineRule="auto" w:line="240"/>
+              <w:ind w:hanging="0" w:start="0" w:end="0"/>
+              <w:jc w:val="start"/>
+              <w:rPr/>
+            </w:pPr>
+            <w:r>
+              <w:rPr/>
+              <w:t>Added EPSS schema info</w:t>
             </w:r>
           </w:p>
         </w:tc>
@@ -1751,26 +1847,15 @@
       </w:r>
       <w:r>
         <w:rPr/>
-        <w:t xml:space="preserve"> ATT&amp;CK, CWE, CVE, CAPEC, ENGAGE, KEV included. </w:t>
-      </w:r>
-    </w:p>
-    <w:p>
-      <w:pPr>
-        <w:pStyle w:val="Normal"/>
-        <w:bidi w:val="0"/>
-        <w:jc w:val="start"/>
-        <w:rPr/>
-      </w:pPr>
-      <w:r>
-        <w:rPr>
-          <w:b/>
-          <w:bCs/>
-        </w:rPr>
-        <w:t>TODO:</w:t>
-      </w:r>
-      <w:r>
-        <w:rPr/>
-        <w:t xml:space="preserve"> include EPSS when available</w:t>
+        <w:t xml:space="preserve"> ATT&amp;CK, CWE, CVE, CAPEC, ENGAGE, KEV, </w:t>
+      </w:r>
+      <w:r>
+        <w:rPr/>
+        <w:t>EPSS</w:t>
+      </w:r>
+      <w:r>
+        <w:rPr/>
+        <w:t xml:space="preserve"> included. </w:t>
       </w:r>
     </w:p>
     <w:p>
@@ -1833,7 +1918,68 @@
       </w:pPr>
       <w:r>
         <w:rPr/>
-        <w:t>[schema graph page]</w:t>
+        <w:t>[schema graph page</w:t>
+      </w:r>
+      <w:r>
+        <w:rPr/>
+        <w:t>]</w:t>
+      </w:r>
+    </w:p>
+    <w:p>
+      <w:pPr>
+        <w:pStyle w:val="Normal"/>
+        <w:bidi w:val="0"/>
+        <w:spacing w:before="0" w:after="0"/>
+        <w:jc w:val="start"/>
+        <w:rPr/>
+      </w:pPr>
+      <w:r>
+        <w:rPr/>
+        <w:drawing>
+          <wp:anchor behindDoc="0" distT="0" distB="0" distL="0" distR="0" simplePos="0" locked="0" layoutInCell="0" allowOverlap="1" relativeHeight="2">
+            <wp:simplePos x="0" y="0"/>
+            <wp:positionH relativeFrom="column">
+              <wp:posOffset>-972820</wp:posOffset>
+            </wp:positionH>
+            <wp:positionV relativeFrom="paragraph">
+              <wp:posOffset>3634105</wp:posOffset>
+            </wp:positionV>
+            <wp:extent cx="7965440" cy="2000250"/>
+            <wp:effectExtent l="0" t="0" r="0" b="0"/>
+            <wp:wrapSquare wrapText="largest"/>
+            <wp:docPr id="1" name="Image1" descr="" title=""/>
+            <wp:cNvGraphicFramePr>
+              <a:graphicFrameLocks xmlns:a="http://schemas.openxmlformats.org/drawingml/2006/main" noChangeAspect="1"/>
+            </wp:cNvGraphicFramePr>
+            <a:graphic xmlns:a="http://schemas.openxmlformats.org/drawingml/2006/main">
+              <a:graphicData uri="http://schemas.openxmlformats.org/drawingml/2006/picture">
+                <pic:pic xmlns:pic="http://schemas.openxmlformats.org/drawingml/2006/picture">
+                  <pic:nvPicPr>
+                    <pic:cNvPr id="1" name="Image1" descr="" title=""/>
+                    <pic:cNvPicPr>
+                      <a:picLocks noChangeAspect="1" noChangeArrowheads="1"/>
+                    </pic:cNvPicPr>
+                  </pic:nvPicPr>
+                  <pic:blipFill>
+                    <a:blip r:embed="rId2"/>
+                    <a:stretch>
+                      <a:fillRect/>
+                    </a:stretch>
+                  </pic:blipFill>
+                  <pic:spPr bwMode="auto">
+                    <a:xfrm rot="16200000">
+                      <a:off x="0" y="0"/>
+                      <a:ext cx="7965440" cy="2000250"/>
+                    </a:xfrm>
+                    <a:prstGeom prst="rect">
+                      <a:avLst/>
+                    </a:prstGeom>
+                  </pic:spPr>
+                </pic:pic>
+              </a:graphicData>
+            </a:graphic>
+          </wp:anchor>
+        </w:drawing>
       </w:r>
       <w:r>
         <w:br w:type="page"/>
@@ -1943,7 +2089,7 @@
         <w:rPr/>
         <w:t xml:space="preserve">The following function from file </w:t>
       </w:r>
-      <w:hyperlink r:id="rId2">
+      <w:hyperlink r:id="rId3">
         <w:r>
           <w:rPr>
             <w:rStyle w:val="Hyperlink"/>
@@ -1957,7 +2103,7 @@
         <w:rPr/>
         <w:t xml:space="preserve"> in Athena </w:t>
       </w:r>
-      <w:hyperlink r:id="rId3">
+      <w:hyperlink r:id="rId4">
         <w:r>
           <w:rPr>
             <w:rStyle w:val="Hyperlink"/>
@@ -2419,7 +2565,7 @@
         <w:rPr/>
         <w:t xml:space="preserve"> in file </w:t>
       </w:r>
-      <w:hyperlink r:id="rId4">
+      <w:hyperlink r:id="rId5">
         <w:r>
           <w:rPr>
             <w:rStyle w:val="Hyperlink"/>
@@ -2433,7 +2579,7 @@
         <w:rPr/>
         <w:t xml:space="preserve"> in Athena </w:t>
       </w:r>
-      <w:hyperlink r:id="rId5">
+      <w:hyperlink r:id="rId6">
         <w:r>
           <w:rPr>
             <w:rStyle w:val="Hyperlink"/>
@@ -11245,7 +11391,7 @@
         <w:rPr/>
         <w:t xml:space="preserve">The CAPEC XML schema is described on </w:t>
       </w:r>
-      <w:hyperlink r:id="rId6">
+      <w:hyperlink r:id="rId7">
         <w:r>
           <w:rPr>
             <w:rStyle w:val="Hyperlink"/>
@@ -14333,7 +14479,7 @@
         <w:rPr/>
         <w:t xml:space="preserve">The KEV dataset is available at </w:t>
       </w:r>
-      <w:hyperlink r:id="rId7">
+      <w:hyperlink r:id="rId8">
         <w:r>
           <w:rPr>
             <w:rStyle w:val="Hyperlink"/>
@@ -14345,7 +14491,7 @@
         <w:rPr/>
         <w:t xml:space="preserve">. All KEVs are packaged in </w:t>
       </w:r>
-      <w:hyperlink r:id="rId8">
+      <w:hyperlink r:id="rId9">
         <w:r>
           <w:rPr>
             <w:rStyle w:val="Hyperlink"/>
@@ -14357,7 +14503,7 @@
         <w:rPr/>
         <w:t xml:space="preserve">. The JSON schema is described </w:t>
       </w:r>
-      <w:hyperlink r:id="rId9">
+      <w:hyperlink r:id="rId10">
         <w:r>
           <w:rPr>
             <w:rStyle w:val="Hyperlink"/>
@@ -15061,10 +15207,526 @@
     </w:p>
     <w:p>
       <w:pPr>
-        <w:pStyle w:val="BodyText"/>
-        <w:spacing w:before="0" w:after="140"/>
-        <w:ind w:end="0"/>
-        <w:rPr/>
+        <w:pStyle w:val="Heading1"/>
+        <w:numPr>
+          <w:ilvl w:val="0"/>
+          <w:numId w:val="1"/>
+        </w:numPr>
+        <w:ind w:hanging="0" w:start="0" w:end="0"/>
+        <w:rPr/>
+      </w:pPr>
+      <w:r>
+        <w:rPr/>
+        <w:t xml:space="preserve">EPSS </w:t>
+      </w:r>
+      <w:r>
+        <w:rPr/>
+        <w:t>Schema</w:t>
+      </w:r>
+    </w:p>
+    <w:p>
+      <w:pPr>
+        <w:pStyle w:val="BodyText"/>
+        <w:ind w:hanging="0" w:start="0" w:end="0"/>
+        <w:rPr/>
+      </w:pPr>
+      <w:r>
+        <w:rPr/>
+        <w:t>The Exploit Prediction Scoring System (</w:t>
+      </w:r>
+      <w:hyperlink r:id="rId11">
+        <w:r>
+          <w:rPr>
+            <w:rStyle w:val="Hyperlink"/>
+          </w:rPr>
+          <w:t>EPSS</w:t>
+        </w:r>
+      </w:hyperlink>
+      <w:r>
+        <w:rPr/>
+        <w:t>) is a data-driven machine-learning model that estimates the probability that a published CVE will be exploited in the wild in the next 30 days.</w:t>
+      </w:r>
+    </w:p>
+    <w:p>
+      <w:pPr>
+        <w:pStyle w:val="BodyText"/>
+        <w:ind w:hanging="0" w:start="0" w:end="0"/>
+        <w:rPr/>
+      </w:pPr>
+      <w:r>
+        <w:rPr/>
+      </w:r>
+    </w:p>
+    <w:p>
+      <w:pPr>
+        <w:pStyle w:val="BodyText"/>
+        <w:ind w:hanging="0" w:start="0" w:end="0"/>
+        <w:rPr/>
+      </w:pPr>
+      <w:r>
+        <w:rPr/>
+        <w:t>It replaces subjective severity judgments with empirical signals from observed exploitation and ongoing activity, helping you focus limited remediation effort where attacks are most likely. EPSS publishes a 0–1 probability (with ranking percentiles) every day for every CVE and makes the data freely and openly accessible via CSV and API, so it slots easily into workflows and dashboards.</w:t>
+      </w:r>
+    </w:p>
+    <w:p>
+      <w:pPr>
+        <w:pStyle w:val="BodyText"/>
+        <w:ind w:hanging="0" w:start="0" w:end="0"/>
+        <w:rPr/>
+      </w:pPr>
+      <w:r>
+        <w:rPr/>
+        <w:t xml:space="preserve">The EPSS </w:t>
+      </w:r>
+      <w:hyperlink r:id="rId12">
+        <w:r>
+          <w:rPr>
+            <w:rStyle w:val="Hyperlink"/>
+          </w:rPr>
+          <w:t>schema</w:t>
+        </w:r>
+      </w:hyperlink>
+      <w:r>
+        <w:rPr/>
+        <w:t xml:space="preserve"> and </w:t>
+      </w:r>
+      <w:hyperlink r:id="rId13">
+        <w:r>
+          <w:rPr>
+            <w:rStyle w:val="Hyperlink"/>
+          </w:rPr>
+          <w:t>dataset</w:t>
+        </w:r>
+      </w:hyperlink>
+      <w:r>
+        <w:rPr/>
+        <w:t xml:space="preserve"> (CSV file).</w:t>
+      </w:r>
+    </w:p>
+    <w:p>
+      <w:pPr>
+        <w:pStyle w:val="BodyText"/>
+        <w:ind w:hanging="0" w:start="0" w:end="0"/>
+        <w:rPr/>
+      </w:pPr>
+      <w:r>
+        <w:rPr/>
+      </w:r>
+    </w:p>
+    <w:p>
+      <w:pPr>
+        <w:pStyle w:val="Heading2"/>
+        <w:numPr>
+          <w:ilvl w:val="1"/>
+          <w:numId w:val="1"/>
+        </w:numPr>
+        <w:ind w:hanging="0" w:start="0" w:end="0"/>
+        <w:rPr/>
+      </w:pPr>
+      <w:r>
+        <w:rPr/>
+        <w:t xml:space="preserve">EPSS </w:t>
+      </w:r>
+      <w:r>
+        <w:rPr/>
+        <w:t>Nodes and Properties</w:t>
+      </w:r>
+    </w:p>
+    <w:p>
+      <w:pPr>
+        <w:pStyle w:val="BodyText"/>
+        <w:rPr>
+          <w:rFonts w:ascii="DejaVu Sans Mono" w:hAnsi="DejaVu Sans Mono" w:eastAsia="Noto Serif CJK SC" w:cs="DejaVu Sans Mono"/>
+          <w:color w:val="auto"/>
+          <w:kern w:val="2"/>
+          <w:sz w:val="20"/>
+          <w:szCs w:val="20"/>
+          <w:lang w:val="en-US" w:eastAsia="zh-CN" w:bidi="hi-IN"/>
+        </w:rPr>
+      </w:pPr>
+      <w:r>
+        <w:rPr>
+          <w:b/>
+          <w:bCs/>
+        </w:rPr>
+        <w:t xml:space="preserve">Node:  </w:t>
+      </w:r>
+      <w:r>
+        <w:rPr>
+          <w:rFonts w:cs="DejaVu Sans Mono" w:ascii="DejaVu Sans Mono" w:hAnsi="DejaVu Sans Mono"/>
+          <w:b/>
+          <w:bCs/>
+          <w:sz w:val="20"/>
+          <w:szCs w:val="20"/>
+        </w:rPr>
+        <w:t>EPSS</w:t>
+      </w:r>
+    </w:p>
+    <w:p>
+      <w:pPr>
+        <w:pStyle w:val="BodyText"/>
+        <w:widowControl/>
+        <w:suppressAutoHyphens w:val="true"/>
+        <w:overflowPunct w:val="true"/>
+        <w:bidi w:val="0"/>
+        <w:spacing w:lineRule="auto" w:line="240" w:before="0" w:after="0"/>
+        <w:ind w:end="-89"/>
+        <w:jc w:val="start"/>
+        <w:rPr>
+          <w:rFonts w:ascii="DejaVu Sans Mono" w:hAnsi="DejaVu Sans Mono" w:eastAsia="Noto Serif CJK SC" w:cs="DejaVu Sans Mono"/>
+          <w:color w:val="auto"/>
+          <w:kern w:val="2"/>
+          <w:sz w:val="20"/>
+          <w:szCs w:val="20"/>
+          <w:lang w:val="en-US" w:eastAsia="zh-CN" w:bidi="hi-IN"/>
+        </w:rPr>
+      </w:pPr>
+      <w:r>
+        <w:rPr>
+          <w:rFonts w:eastAsia="Noto Serif CJK SC" w:cs="DejaVu Sans Mono" w:ascii="DejaVu Sans Mono" w:hAnsi="DejaVu Sans Mono"/>
+          <w:color w:val="auto"/>
+          <w:kern w:val="2"/>
+          <w:sz w:val="20"/>
+          <w:szCs w:val="20"/>
+          <w:lang w:val="en-US" w:eastAsia="zh-CN" w:bidi="hi-IN"/>
+        </w:rPr>
+        <w:t>Properties:</w:t>
+      </w:r>
+    </w:p>
+    <w:p>
+      <w:pPr>
+        <w:pStyle w:val="BodyText"/>
+        <w:widowControl/>
+        <w:suppressAutoHyphens w:val="true"/>
+        <w:overflowPunct w:val="true"/>
+        <w:bidi w:val="0"/>
+        <w:spacing w:lineRule="auto" w:line="240" w:before="0" w:after="0"/>
+        <w:ind w:end="-89"/>
+        <w:jc w:val="start"/>
+        <w:rPr>
+          <w:rFonts w:ascii="DejaVu Sans Mono" w:hAnsi="DejaVu Sans Mono" w:eastAsia="Noto Serif CJK SC" w:cs="DejaVu Sans Mono"/>
+          <w:color w:val="auto"/>
+          <w:kern w:val="2"/>
+          <w:sz w:val="20"/>
+          <w:szCs w:val="20"/>
+          <w:lang w:val="en-US" w:eastAsia="zh-CN" w:bidi="hi-IN"/>
+        </w:rPr>
+      </w:pPr>
+      <w:r>
+        <w:rPr>
+          <w:rFonts w:eastAsia="Noto Serif CJK SC" w:cs="DejaVu Sans Mono" w:ascii="DejaVu Sans Mono" w:hAnsi="DejaVu Sans Mono"/>
+          <w:color w:val="auto"/>
+          <w:kern w:val="2"/>
+          <w:sz w:val="20"/>
+          <w:szCs w:val="20"/>
+          <w:lang w:val="en-US" w:eastAsia="zh-CN" w:bidi="hi-IN"/>
+        </w:rPr>
+        <w:t>cve</w:t>
+        <w:tab/>
+        <w:tab/>
+        <w:t>string</w:t>
+        <w:tab/>
+        <w:tab/>
+        <w:t>CVE ID</w:t>
+      </w:r>
+    </w:p>
+    <w:p>
+      <w:pPr>
+        <w:pStyle w:val="BodyText"/>
+        <w:widowControl/>
+        <w:suppressAutoHyphens w:val="true"/>
+        <w:overflowPunct w:val="true"/>
+        <w:bidi w:val="0"/>
+        <w:spacing w:lineRule="auto" w:line="240" w:before="0" w:after="0"/>
+        <w:ind w:end="-89"/>
+        <w:jc w:val="start"/>
+        <w:rPr>
+          <w:rFonts w:ascii="DejaVu Sans Mono" w:hAnsi="DejaVu Sans Mono" w:eastAsia="Noto Serif CJK SC" w:cs="DejaVu Sans Mono"/>
+          <w:color w:val="auto"/>
+          <w:kern w:val="2"/>
+          <w:sz w:val="20"/>
+          <w:szCs w:val="20"/>
+          <w:lang w:val="en-US" w:eastAsia="zh-CN" w:bidi="hi-IN"/>
+        </w:rPr>
+      </w:pPr>
+      <w:r>
+        <w:rPr>
+          <w:rFonts w:eastAsia="Noto Serif CJK SC" w:cs="DejaVu Sans Mono" w:ascii="DejaVu Sans Mono" w:hAnsi="DejaVu Sans Mono"/>
+          <w:color w:val="auto"/>
+          <w:kern w:val="2"/>
+          <w:sz w:val="20"/>
+          <w:szCs w:val="20"/>
+          <w:lang w:val="en-US" w:eastAsia="zh-CN" w:bidi="hi-IN"/>
+        </w:rPr>
+        <w:t>epss</w:t>
+        <w:tab/>
+        <w:tab/>
+        <w:t>float [0,1]</w:t>
+        <w:tab/>
+        <w:tab/>
+        <w:t>probability of exploit in the next 30 days</w:t>
+      </w:r>
+    </w:p>
+    <w:p>
+      <w:pPr>
+        <w:pStyle w:val="BodyText"/>
+        <w:widowControl/>
+        <w:suppressAutoHyphens w:val="true"/>
+        <w:overflowPunct w:val="true"/>
+        <w:bidi w:val="0"/>
+        <w:spacing w:lineRule="auto" w:line="240" w:before="0" w:after="0"/>
+        <w:ind w:end="-89"/>
+        <w:jc w:val="start"/>
+        <w:rPr>
+          <w:rFonts w:ascii="DejaVu Sans Mono" w:hAnsi="DejaVu Sans Mono" w:eastAsia="Noto Serif CJK SC" w:cs="DejaVu Sans Mono"/>
+          <w:color w:val="auto"/>
+          <w:kern w:val="2"/>
+          <w:sz w:val="20"/>
+          <w:szCs w:val="20"/>
+          <w:lang w:val="en-US" w:eastAsia="zh-CN" w:bidi="hi-IN"/>
+        </w:rPr>
+      </w:pPr>
+      <w:r>
+        <w:rPr>
+          <w:rFonts w:eastAsia="Noto Serif CJK SC" w:cs="DejaVu Sans Mono" w:ascii="DejaVu Sans Mono" w:hAnsi="DejaVu Sans Mono"/>
+          <w:color w:val="auto"/>
+          <w:kern w:val="2"/>
+          <w:sz w:val="20"/>
+          <w:szCs w:val="20"/>
+          <w:lang w:val="en-US" w:eastAsia="zh-CN" w:bidi="hi-IN"/>
+        </w:rPr>
+        <w:t>percentile</w:t>
+        <w:tab/>
+        <w:t>float [0,1]</w:t>
+        <w:tab/>
+        <w:tab/>
+        <w:t xml:space="preserve">proportion of all scored vulnerabilities with the </w:t>
+      </w:r>
+    </w:p>
+    <w:p>
+      <w:pPr>
+        <w:pStyle w:val="BodyText"/>
+        <w:widowControl/>
+        <w:suppressAutoHyphens w:val="true"/>
+        <w:overflowPunct w:val="true"/>
+        <w:bidi w:val="0"/>
+        <w:spacing w:lineRule="auto" w:line="240" w:before="0" w:after="0"/>
+        <w:ind w:end="-89"/>
+        <w:jc w:val="start"/>
+        <w:rPr>
+          <w:rFonts w:ascii="DejaVu Sans Mono" w:hAnsi="DejaVu Sans Mono" w:eastAsia="Noto Serif CJK SC" w:cs="DejaVu Sans Mono"/>
+          <w:color w:val="auto"/>
+          <w:kern w:val="2"/>
+          <w:sz w:val="20"/>
+          <w:szCs w:val="20"/>
+          <w:lang w:val="en-US" w:eastAsia="zh-CN" w:bidi="hi-IN"/>
+        </w:rPr>
+      </w:pPr>
+      <w:r>
+        <w:rPr>
+          <w:rFonts w:eastAsia="Noto Serif CJK SC" w:cs="DejaVu Sans Mono" w:ascii="DejaVu Sans Mono" w:hAnsi="DejaVu Sans Mono"/>
+          <w:color w:val="auto"/>
+          <w:kern w:val="2"/>
+          <w:sz w:val="20"/>
+          <w:szCs w:val="20"/>
+          <w:lang w:val="en-US" w:eastAsia="zh-CN" w:bidi="hi-IN"/>
+        </w:rPr>
+        <w:tab/>
+        <w:tab/>
+        <w:tab/>
+        <w:tab/>
+        <w:tab/>
+        <w:tab/>
+        <w:t>same or a lower EPSS score</w:t>
+      </w:r>
+    </w:p>
+    <w:p>
+      <w:pPr>
+        <w:pStyle w:val="BodyText"/>
+        <w:widowControl/>
+        <w:suppressAutoHyphens w:val="true"/>
+        <w:overflowPunct w:val="true"/>
+        <w:bidi w:val="0"/>
+        <w:spacing w:lineRule="auto" w:line="240" w:before="0" w:after="0"/>
+        <w:ind w:end="-89"/>
+        <w:jc w:val="start"/>
+        <w:rPr>
+          <w:rFonts w:ascii="DejaVu Sans Mono" w:hAnsi="DejaVu Sans Mono" w:eastAsia="Noto Serif CJK SC" w:cs="DejaVu Sans Mono"/>
+          <w:color w:val="auto"/>
+          <w:kern w:val="2"/>
+          <w:sz w:val="20"/>
+          <w:szCs w:val="20"/>
+          <w:lang w:val="en-US" w:eastAsia="zh-CN" w:bidi="hi-IN"/>
+        </w:rPr>
+      </w:pPr>
+      <w:r>
+        <w:rPr/>
+      </w:r>
+    </w:p>
+    <w:p>
+      <w:pPr>
+        <w:pStyle w:val="BodyText"/>
+        <w:widowControl/>
+        <w:suppressAutoHyphens w:val="true"/>
+        <w:overflowPunct w:val="true"/>
+        <w:bidi w:val="0"/>
+        <w:spacing w:lineRule="auto" w:line="240" w:before="0" w:after="0"/>
+        <w:ind w:end="-89"/>
+        <w:jc w:val="start"/>
+        <w:rPr>
+          <w:rFonts w:ascii="DejaVu Sans Mono" w:hAnsi="DejaVu Sans Mono" w:eastAsia="Noto Serif CJK SC" w:cs="DejaVu Sans Mono"/>
+          <w:color w:val="auto"/>
+          <w:kern w:val="2"/>
+          <w:sz w:val="20"/>
+          <w:szCs w:val="20"/>
+          <w:lang w:val="en-US" w:eastAsia="zh-CN" w:bidi="hi-IN"/>
+        </w:rPr>
+      </w:pPr>
+      <w:r>
+        <w:rPr>
+          <w:rFonts w:eastAsia="Noto Serif CJK SC" w:cs="DejaVu Sans Mono" w:ascii="DejaVu Sans Mono" w:hAnsi="DejaVu Sans Mono"/>
+          <w:color w:val="auto"/>
+          <w:kern w:val="2"/>
+          <w:sz w:val="20"/>
+          <w:szCs w:val="20"/>
+          <w:lang w:val="en-US" w:eastAsia="zh-CN" w:bidi="hi-IN"/>
+        </w:rPr>
+        <w:t>summary of properties: cve, epss, percentile</w:t>
+      </w:r>
+    </w:p>
+    <w:p>
+      <w:pPr>
+        <w:pStyle w:val="Heading2"/>
+        <w:numPr>
+          <w:ilvl w:val="0"/>
+          <w:numId w:val="0"/>
+        </w:numPr>
+        <w:ind w:hanging="0" w:start="0" w:end="0"/>
+        <w:rPr>
+          <w:rFonts w:ascii="DejaVu Sans Mono" w:hAnsi="DejaVu Sans Mono" w:eastAsia="Noto Serif CJK SC" w:cs="DejaVu Sans Mono"/>
+          <w:color w:val="auto"/>
+          <w:kern w:val="2"/>
+          <w:sz w:val="20"/>
+          <w:szCs w:val="20"/>
+          <w:lang w:val="en-US" w:eastAsia="zh-CN" w:bidi="hi-IN"/>
+        </w:rPr>
+      </w:pPr>
+      <w:r>
+        <w:rPr/>
+      </w:r>
+    </w:p>
+    <w:p>
+      <w:pPr>
+        <w:pStyle w:val="Heading2"/>
+        <w:numPr>
+          <w:ilvl w:val="1"/>
+          <w:numId w:val="1"/>
+        </w:numPr>
+        <w:ind w:hanging="0" w:start="0" w:end="0"/>
+        <w:rPr>
+          <w:rFonts w:ascii="DejaVu Sans Mono" w:hAnsi="DejaVu Sans Mono" w:eastAsia="Noto Serif CJK SC" w:cs="DejaVu Sans Mono"/>
+          <w:color w:val="auto"/>
+          <w:kern w:val="2"/>
+          <w:sz w:val="20"/>
+          <w:szCs w:val="20"/>
+          <w:lang w:val="en-US" w:eastAsia="zh-CN" w:bidi="hi-IN"/>
+        </w:rPr>
+      </w:pPr>
+      <w:r>
+        <w:rPr/>
+        <w:t xml:space="preserve">EPSS </w:t>
+      </w:r>
+      <w:r>
+        <w:rPr/>
+        <w:t>Edges</w:t>
+      </w:r>
+    </w:p>
+    <w:p>
+      <w:pPr>
+        <w:pStyle w:val="BodyText"/>
+        <w:widowControl/>
+        <w:suppressAutoHyphens w:val="true"/>
+        <w:overflowPunct w:val="true"/>
+        <w:bidi w:val="0"/>
+        <w:spacing w:lineRule="auto" w:line="240" w:before="0" w:after="0"/>
+        <w:ind w:end="-89"/>
+        <w:jc w:val="start"/>
+        <w:rPr>
+          <w:rFonts w:ascii="DejaVu Sans Mono" w:hAnsi="DejaVu Sans Mono" w:eastAsia="Noto Serif CJK SC" w:cs="DejaVu Sans Mono"/>
+          <w:color w:val="auto"/>
+          <w:kern w:val="2"/>
+          <w:sz w:val="20"/>
+          <w:szCs w:val="20"/>
+          <w:lang w:val="en-US" w:eastAsia="zh-CN" w:bidi="hi-IN"/>
+        </w:rPr>
+      </w:pPr>
+      <w:r>
+        <w:rPr/>
+        <w:t>EPSS</w:t>
+      </w:r>
+      <w:r>
+        <w:rPr/>
+        <w:t xml:space="preserve"> - [:</w:t>
+      </w:r>
+      <w:r>
+        <w:rPr/>
+        <w:t>scores] -&gt; CVE</w:t>
+        <w:tab/>
+        <w:tab/>
+      </w:r>
+      <w:r>
+        <w:rPr>
+          <w:rFonts w:eastAsia="Noto Serif CJK SC" w:cs="DejaVu Sans Mono" w:ascii="DejaVu Sans Mono" w:hAnsi="DejaVu Sans Mono"/>
+          <w:color w:val="auto"/>
+          <w:kern w:val="2"/>
+          <w:sz w:val="20"/>
+          <w:szCs w:val="20"/>
+          <w:lang w:val="en-US" w:eastAsia="zh-CN" w:bidi="hi-IN"/>
+        </w:rPr>
+        <w:t>defined by EPSS.cve property, multiplicity 1</w:t>
+      </w:r>
+    </w:p>
+    <w:p>
+      <w:pPr>
+        <w:pStyle w:val="BodyText"/>
+        <w:widowControl/>
+        <w:suppressAutoHyphens w:val="true"/>
+        <w:overflowPunct w:val="true"/>
+        <w:bidi w:val="0"/>
+        <w:spacing w:lineRule="auto" w:line="240" w:before="0" w:after="0"/>
+        <w:ind w:end="-89"/>
+        <w:jc w:val="start"/>
+        <w:rPr>
+          <w:rFonts w:ascii="DejaVu Sans Mono" w:hAnsi="DejaVu Sans Mono" w:eastAsia="Noto Serif CJK SC" w:cs="DejaVu Sans Mono"/>
+          <w:color w:val="auto"/>
+          <w:kern w:val="2"/>
+          <w:sz w:val="20"/>
+          <w:szCs w:val="20"/>
+          <w:lang w:val="en-US" w:eastAsia="zh-CN" w:bidi="hi-IN"/>
+        </w:rPr>
+      </w:pPr>
+      <w:r>
+        <w:rPr/>
+      </w:r>
+    </w:p>
+    <w:p>
+      <w:pPr>
+        <w:pStyle w:val="BodyText"/>
+        <w:widowControl/>
+        <w:suppressAutoHyphens w:val="true"/>
+        <w:overflowPunct w:val="true"/>
+        <w:bidi w:val="0"/>
+        <w:spacing w:lineRule="auto" w:line="240" w:before="0" w:after="0"/>
+        <w:ind w:end="-89"/>
+        <w:jc w:val="start"/>
+        <w:rPr>
+          <w:rFonts w:ascii="DejaVu Sans Mono" w:hAnsi="DejaVu Sans Mono" w:eastAsia="Noto Serif CJK SC" w:cs="DejaVu Sans Mono"/>
+          <w:color w:val="auto"/>
+          <w:kern w:val="2"/>
+          <w:sz w:val="20"/>
+          <w:szCs w:val="20"/>
+          <w:lang w:val="en-US" w:eastAsia="zh-CN" w:bidi="hi-IN"/>
+        </w:rPr>
       </w:pPr>
       <w:r>
         <w:rPr/>
@@ -15111,7 +15773,7 @@
           <w:kern w:val="0"/>
           <w:lang w:val="en-US" w:eastAsia="en-US" w:bidi="en-US"/>
         </w:rPr>
-        <w:t>ATT&amp;CK changed in 10/2025: new nodes: analyic and detectin strategy + reltionships</w:t>
+        <w:t>ATT&amp;CK changed in 10/2025: new nodes: analytic and detection strategy + relationships</w:t>
       </w:r>
     </w:p>
   </w:comment>

</xml_diff>

<commit_message>
revised 02/26 sample templates; relaxted empty string field generation
</commit_message>
<xml_diff>
--- a/tmpl_gen/docs/CTI-DB-Schema-details.docx
+++ b/tmpl_gen/docs/CTI-DB-Schema-details.docx
@@ -152,7 +152,7 @@
                 <w:tab w:val="left" w:pos="725" w:leader="none"/>
               </w:tabs>
               <w:suppressAutoHyphens w:val="true"/>
-              <w:overflowPunct w:val="true"/>
+              <w:overflowPunct w:val="false"/>
               <w:bidi w:val="0"/>
               <w:snapToGrid w:val="false"/>
               <w:spacing w:lineRule="auto" w:line="240"/>
@@ -210,7 +210,7 @@
                 <w:tab w:val="left" w:pos="725" w:leader="none"/>
               </w:tabs>
               <w:suppressAutoHyphens w:val="true"/>
-              <w:overflowPunct w:val="true"/>
+              <w:overflowPunct w:val="false"/>
               <w:bidi w:val="0"/>
               <w:snapToGrid w:val="false"/>
               <w:spacing w:lineRule="auto" w:line="240"/>
@@ -268,7 +268,7 @@
                 <w:tab w:val="left" w:pos="725" w:leader="none"/>
               </w:tabs>
               <w:suppressAutoHyphens w:val="true"/>
-              <w:overflowPunct w:val="true"/>
+              <w:overflowPunct w:val="false"/>
               <w:bidi w:val="0"/>
               <w:snapToGrid w:val="false"/>
               <w:spacing w:lineRule="auto" w:line="240"/>
@@ -326,7 +326,7 @@
                 <w:tab w:val="left" w:pos="725" w:leader="none"/>
               </w:tabs>
               <w:suppressAutoHyphens w:val="true"/>
-              <w:overflowPunct w:val="true"/>
+              <w:overflowPunct w:val="false"/>
               <w:bidi w:val="0"/>
               <w:snapToGrid w:val="false"/>
               <w:spacing w:lineRule="auto" w:line="240"/>
@@ -384,7 +384,7 @@
                 <w:tab w:val="left" w:pos="725" w:leader="none"/>
               </w:tabs>
               <w:suppressAutoHyphens w:val="true"/>
-              <w:overflowPunct w:val="true"/>
+              <w:overflowPunct w:val="false"/>
               <w:bidi w:val="0"/>
               <w:snapToGrid w:val="false"/>
               <w:spacing w:lineRule="auto" w:line="240"/>
@@ -442,7 +442,7 @@
                 <w:tab w:val="left" w:pos="725" w:leader="none"/>
               </w:tabs>
               <w:suppressAutoHyphens w:val="true"/>
-              <w:overflowPunct w:val="true"/>
+              <w:overflowPunct w:val="false"/>
               <w:bidi w:val="0"/>
               <w:snapToGrid w:val="false"/>
               <w:spacing w:lineRule="auto" w:line="240"/>
@@ -500,7 +500,7 @@
                 <w:tab w:val="left" w:pos="725" w:leader="none"/>
               </w:tabs>
               <w:suppressAutoHyphens w:val="true"/>
-              <w:overflowPunct w:val="true"/>
+              <w:overflowPunct w:val="false"/>
               <w:bidi w:val="0"/>
               <w:snapToGrid w:val="false"/>
               <w:spacing w:lineRule="auto" w:line="240"/>
@@ -558,7 +558,7 @@
                 <w:tab w:val="left" w:pos="725" w:leader="none"/>
               </w:tabs>
               <w:suppressAutoHyphens w:val="true"/>
-              <w:overflowPunct w:val="true"/>
+              <w:overflowPunct w:val="false"/>
               <w:bidi w:val="0"/>
               <w:snapToGrid w:val="false"/>
               <w:spacing w:lineRule="auto" w:line="240"/>
@@ -616,7 +616,7 @@
                 <w:tab w:val="left" w:pos="725" w:leader="none"/>
               </w:tabs>
               <w:suppressAutoHyphens w:val="true"/>
-              <w:overflowPunct w:val="true"/>
+              <w:overflowPunct w:val="false"/>
               <w:bidi w:val="0"/>
               <w:snapToGrid w:val="false"/>
               <w:spacing w:lineRule="auto" w:line="240"/>
@@ -674,7 +674,7 @@
                 <w:tab w:val="left" w:pos="725" w:leader="none"/>
               </w:tabs>
               <w:suppressAutoHyphens w:val="true"/>
-              <w:overflowPunct w:val="true"/>
+              <w:overflowPunct w:val="false"/>
               <w:bidi w:val="0"/>
               <w:snapToGrid w:val="false"/>
               <w:spacing w:lineRule="auto" w:line="240"/>
@@ -732,7 +732,7 @@
                 <w:tab w:val="left" w:pos="725" w:leader="none"/>
               </w:tabs>
               <w:suppressAutoHyphens w:val="true"/>
-              <w:overflowPunct w:val="true"/>
+              <w:overflowPunct w:val="false"/>
               <w:bidi w:val="0"/>
               <w:snapToGrid w:val="false"/>
               <w:spacing w:lineRule="auto" w:line="240"/>
@@ -790,7 +790,7 @@
                 <w:tab w:val="left" w:pos="725" w:leader="none"/>
               </w:tabs>
               <w:suppressAutoHyphens w:val="true"/>
-              <w:overflowPunct w:val="true"/>
+              <w:overflowPunct w:val="false"/>
               <w:bidi w:val="0"/>
               <w:snapToGrid w:val="false"/>
               <w:spacing w:lineRule="auto" w:line="240"/>
@@ -848,7 +848,7 @@
                 <w:tab w:val="left" w:pos="725" w:leader="none"/>
               </w:tabs>
               <w:suppressAutoHyphens w:val="true"/>
-              <w:overflowPunct w:val="true"/>
+              <w:overflowPunct w:val="false"/>
               <w:bidi w:val="0"/>
               <w:snapToGrid w:val="false"/>
               <w:spacing w:lineRule="auto" w:line="240"/>
@@ -906,7 +906,7 @@
                 <w:tab w:val="left" w:pos="725" w:leader="none"/>
               </w:tabs>
               <w:suppressAutoHyphens w:val="true"/>
-              <w:overflowPunct w:val="true"/>
+              <w:overflowPunct w:val="false"/>
               <w:bidi w:val="0"/>
               <w:snapToGrid w:val="false"/>
               <w:spacing w:lineRule="auto" w:line="240"/>
@@ -964,7 +964,7 @@
                 <w:tab w:val="left" w:pos="725" w:leader="none"/>
               </w:tabs>
               <w:suppressAutoHyphens w:val="true"/>
-              <w:overflowPunct w:val="true"/>
+              <w:overflowPunct w:val="false"/>
               <w:bidi w:val="0"/>
               <w:snapToGrid w:val="false"/>
               <w:spacing w:lineRule="auto" w:line="240"/>
@@ -1022,7 +1022,7 @@
                 <w:tab w:val="left" w:pos="725" w:leader="none"/>
               </w:tabs>
               <w:suppressAutoHyphens w:val="true"/>
-              <w:overflowPunct w:val="true"/>
+              <w:overflowPunct w:val="false"/>
               <w:bidi w:val="0"/>
               <w:snapToGrid w:val="false"/>
               <w:spacing w:lineRule="auto" w:line="240"/>
@@ -1461,13 +1461,30 @@
                 <w:tab w:val="left" w:pos="725" w:leader="none"/>
               </w:tabs>
               <w:suppressAutoHyphens w:val="true"/>
-              <w:overflowPunct w:val="true"/>
+              <w:overflowPunct w:val="false"/>
               <w:bidi w:val="0"/>
               <w:snapToGrid w:val="false"/>
-              <w:spacing w:lineRule="auto" w:line="240"/>
+              <w:spacing w:lineRule="auto" w:line="240" w:before="0" w:after="0"/>
               <w:ind w:hanging="0" w:start="0" w:end="0"/>
               <w:jc w:val="start"/>
-              <w:rPr/>
+              <w:rPr>
+                <w:rFonts w:ascii="Liberation Serif;Times New Roman" w:hAnsi="Liberation Serif;Times New Roman" w:eastAsia="Noto Serif CJK SC" w:cs="Liberation Serif;Times New Roman"/>
+                <w:b w:val="false"/>
+                <w:bCs w:val="false"/>
+                <w:i w:val="false"/>
+                <w:i w:val="false"/>
+                <w:iCs w:val="false"/>
+                <w:strike w:val="false"/>
+                <w:dstrike w:val="false"/>
+                <w:outline w:val="false"/>
+                <w:shadow w:val="false"/>
+                <w:color w:val="000000"/>
+                <w:kern w:val="2"/>
+                <w:sz w:val="20"/>
+                <w:szCs w:val="20"/>
+                <w:u w:val="none"/>
+                <w:lang w:val="en-US" w:eastAsia="zh-CN" w:bidi="hi-IN"/>
+              </w:rPr>
             </w:pPr>
             <w:r>
               <w:rPr>
@@ -1565,16 +1582,49 @@
                 <w:tab w:val="left" w:pos="725" w:leader="none"/>
               </w:tabs>
               <w:suppressAutoHyphens w:val="true"/>
-              <w:overflowPunct w:val="true"/>
+              <w:overflowPunct w:val="false"/>
               <w:bidi w:val="0"/>
               <w:snapToGrid w:val="false"/>
-              <w:spacing w:lineRule="auto" w:line="240"/>
+              <w:spacing w:lineRule="auto" w:line="240" w:before="0" w:after="0"/>
               <w:ind w:hanging="0" w:start="0" w:end="0"/>
               <w:jc w:val="start"/>
-              <w:rPr/>
+              <w:rPr>
+                <w:rFonts w:ascii="Liberation Serif;Times New Roman" w:hAnsi="Liberation Serif;Times New Roman" w:eastAsia="Noto Serif CJK SC" w:cs="Liberation Serif;Times New Roman"/>
+                <w:b w:val="false"/>
+                <w:bCs w:val="false"/>
+                <w:i w:val="false"/>
+                <w:i w:val="false"/>
+                <w:iCs w:val="false"/>
+                <w:strike w:val="false"/>
+                <w:dstrike w:val="false"/>
+                <w:outline w:val="false"/>
+                <w:shadow w:val="false"/>
+                <w:color w:val="000000"/>
+                <w:kern w:val="2"/>
+                <w:sz w:val="20"/>
+                <w:szCs w:val="20"/>
+                <w:u w:val="none"/>
+                <w:lang w:val="en-US" w:eastAsia="zh-CN" w:bidi="hi-IN"/>
+              </w:rPr>
             </w:pPr>
             <w:r>
-              <w:rPr/>
+              <w:rPr>
+                <w:rFonts w:eastAsia="Noto Serif CJK SC" w:cs="Liberation Serif;Times New Roman"/>
+                <w:b w:val="false"/>
+                <w:bCs w:val="false"/>
+                <w:i w:val="false"/>
+                <w:iCs w:val="false"/>
+                <w:strike w:val="false"/>
+                <w:dstrike w:val="false"/>
+                <w:outline w:val="false"/>
+                <w:shadow w:val="false"/>
+                <w:color w:val="000000"/>
+                <w:kern w:val="2"/>
+                <w:sz w:val="20"/>
+                <w:szCs w:val="20"/>
+                <w:u w:val="none"/>
+                <w:lang w:val="en-US" w:eastAsia="zh-CN" w:bidi="hi-IN"/>
+              </w:rPr>
               <w:t>corrected the CVE node property list (summary)</w:t>
             </w:r>
           </w:p>
@@ -1653,25 +1703,50 @@
                 <w:tab w:val="left" w:pos="725" w:leader="none"/>
               </w:tabs>
               <w:suppressAutoHyphens w:val="true"/>
-              <w:overflowPunct w:val="true"/>
+              <w:overflowPunct w:val="false"/>
               <w:bidi w:val="0"/>
               <w:snapToGrid w:val="false"/>
-              <w:spacing w:lineRule="auto" w:line="240"/>
+              <w:spacing w:lineRule="auto" w:line="240" w:before="0" w:after="0"/>
               <w:ind w:hanging="0" w:start="0" w:end="0"/>
               <w:jc w:val="start"/>
-              <w:rPr/>
+              <w:rPr>
+                <w:rFonts w:ascii="Liberation Serif;Times New Roman" w:hAnsi="Liberation Serif;Times New Roman" w:eastAsia="Noto Serif CJK SC" w:cs="Liberation Serif;Times New Roman"/>
+                <w:b w:val="false"/>
+                <w:bCs w:val="false"/>
+                <w:i w:val="false"/>
+                <w:i w:val="false"/>
+                <w:iCs w:val="false"/>
+                <w:strike w:val="false"/>
+                <w:dstrike w:val="false"/>
+                <w:outline w:val="false"/>
+                <w:shadow w:val="false"/>
+                <w:color w:val="000000"/>
+                <w:kern w:val="2"/>
+                <w:sz w:val="20"/>
+                <w:szCs w:val="20"/>
+                <w:u w:val="none"/>
+                <w:lang w:val="en-US" w:eastAsia="zh-CN" w:bidi="hi-IN"/>
+              </w:rPr>
             </w:pPr>
             <w:r>
-              <w:rPr/>
-              <w:t xml:space="preserve">CAPEC node: </w:t>
-            </w:r>
-            <w:r>
-              <w:rPr/>
-              <w:t xml:space="preserve">added </w:t>
-            </w:r>
-            <w:r>
-              <w:rPr/>
-              <w:t>abstraction property to the summary</w:t>
+              <w:rPr>
+                <w:rFonts w:eastAsia="Noto Serif CJK SC" w:cs="Liberation Serif;Times New Roman"/>
+                <w:b w:val="false"/>
+                <w:bCs w:val="false"/>
+                <w:i w:val="false"/>
+                <w:iCs w:val="false"/>
+                <w:strike w:val="false"/>
+                <w:dstrike w:val="false"/>
+                <w:outline w:val="false"/>
+                <w:shadow w:val="false"/>
+                <w:color w:val="000000"/>
+                <w:kern w:val="2"/>
+                <w:sz w:val="20"/>
+                <w:szCs w:val="20"/>
+                <w:u w:val="none"/>
+                <w:lang w:val="en-US" w:eastAsia="zh-CN" w:bidi="hi-IN"/>
+              </w:rPr>
+              <w:t>CAPEC node: added abstraction property to the summary</w:t>
             </w:r>
           </w:p>
         </w:tc>
@@ -1749,16 +1824,49 @@
                 <w:tab w:val="left" w:pos="725" w:leader="none"/>
               </w:tabs>
               <w:suppressAutoHyphens w:val="true"/>
-              <w:overflowPunct w:val="true"/>
+              <w:overflowPunct w:val="false"/>
               <w:bidi w:val="0"/>
               <w:snapToGrid w:val="false"/>
-              <w:spacing w:lineRule="auto" w:line="240"/>
+              <w:spacing w:lineRule="auto" w:line="240" w:before="0" w:after="0"/>
               <w:ind w:hanging="0" w:start="0" w:end="0"/>
               <w:jc w:val="start"/>
-              <w:rPr/>
+              <w:rPr>
+                <w:rFonts w:ascii="Liberation Serif;Times New Roman" w:hAnsi="Liberation Serif;Times New Roman" w:eastAsia="Noto Serif CJK SC" w:cs="Liberation Serif;Times New Roman"/>
+                <w:b w:val="false"/>
+                <w:bCs w:val="false"/>
+                <w:i w:val="false"/>
+                <w:i w:val="false"/>
+                <w:iCs w:val="false"/>
+                <w:strike w:val="false"/>
+                <w:dstrike w:val="false"/>
+                <w:outline w:val="false"/>
+                <w:shadow w:val="false"/>
+                <w:color w:val="000000"/>
+                <w:kern w:val="2"/>
+                <w:sz w:val="20"/>
+                <w:szCs w:val="20"/>
+                <w:u w:val="none"/>
+                <w:lang w:val="en-US" w:eastAsia="zh-CN" w:bidi="hi-IN"/>
+              </w:rPr>
             </w:pPr>
             <w:r>
-              <w:rPr/>
+              <w:rPr>
+                <w:rFonts w:eastAsia="Noto Serif CJK SC" w:cs="Liberation Serif;Times New Roman"/>
+                <w:b w:val="false"/>
+                <w:bCs w:val="false"/>
+                <w:i w:val="false"/>
+                <w:iCs w:val="false"/>
+                <w:strike w:val="false"/>
+                <w:dstrike w:val="false"/>
+                <w:outline w:val="false"/>
+                <w:shadow w:val="false"/>
+                <w:color w:val="000000"/>
+                <w:kern w:val="2"/>
+                <w:sz w:val="20"/>
+                <w:szCs w:val="20"/>
+                <w:u w:val="none"/>
+                <w:lang w:val="en-US" w:eastAsia="zh-CN" w:bidi="hi-IN"/>
+              </w:rPr>
               <w:t>Added EPSS schema info</w:t>
             </w:r>
           </w:p>
@@ -1847,15 +1955,7 @@
       </w:r>
       <w:r>
         <w:rPr/>
-        <w:t xml:space="preserve"> ATT&amp;CK, CWE, CVE, CAPEC, ENGAGE, KEV, </w:t>
-      </w:r>
-      <w:r>
-        <w:rPr/>
-        <w:t>EPSS</w:t>
-      </w:r>
-      <w:r>
-        <w:rPr/>
-        <w:t xml:space="preserve"> included. </w:t>
+        <w:t xml:space="preserve"> ATT&amp;CK, CWE, CVE, CAPEC, ENGAGE, KEV, EPSS included. </w:t>
       </w:r>
     </w:p>
     <w:p>
@@ -1918,11 +2018,7 @@
       </w:pPr>
       <w:r>
         <w:rPr/>
-        <w:t>[schema graph page</w:t>
-      </w:r>
-      <w:r>
-        <w:rPr/>
-        <w:t>]</w:t>
+        <w:t>[schema graph page]</w:t>
       </w:r>
     </w:p>
     <w:p>
@@ -1935,51 +2031,79 @@
       </w:pPr>
       <w:r>
         <w:rPr/>
-        <w:drawing>
-          <wp:anchor behindDoc="0" distT="0" distB="0" distL="0" distR="0" simplePos="0" locked="0" layoutInCell="0" allowOverlap="1" relativeHeight="2">
-            <wp:simplePos x="0" y="0"/>
-            <wp:positionH relativeFrom="column">
-              <wp:posOffset>-972820</wp:posOffset>
-            </wp:positionH>
-            <wp:positionV relativeFrom="paragraph">
-              <wp:posOffset>3634105</wp:posOffset>
-            </wp:positionV>
-            <wp:extent cx="7965440" cy="2000250"/>
-            <wp:effectExtent l="0" t="0" r="0" b="0"/>
-            <wp:wrapSquare wrapText="largest"/>
-            <wp:docPr id="1" name="Image1" descr="" title=""/>
-            <wp:cNvGraphicFramePr>
-              <a:graphicFrameLocks xmlns:a="http://schemas.openxmlformats.org/drawingml/2006/main" noChangeAspect="1"/>
-            </wp:cNvGraphicFramePr>
-            <a:graphic xmlns:a="http://schemas.openxmlformats.org/drawingml/2006/main">
-              <a:graphicData uri="http://schemas.openxmlformats.org/drawingml/2006/picture">
-                <pic:pic xmlns:pic="http://schemas.openxmlformats.org/drawingml/2006/picture">
-                  <pic:nvPicPr>
-                    <pic:cNvPr id="1" name="Image1" descr="" title=""/>
-                    <pic:cNvPicPr>
-                      <a:picLocks noChangeAspect="1" noChangeArrowheads="1"/>
-                    </pic:cNvPicPr>
-                  </pic:nvPicPr>
-                  <pic:blipFill>
-                    <a:blip r:embed="rId2"/>
-                    <a:stretch>
-                      <a:fillRect/>
-                    </a:stretch>
-                  </pic:blipFill>
-                  <pic:spPr bwMode="auto">
-                    <a:xfrm rot="16200000">
-                      <a:off x="0" y="0"/>
-                      <a:ext cx="7965440" cy="2000250"/>
-                    </a:xfrm>
-                    <a:prstGeom prst="rect">
-                      <a:avLst/>
-                    </a:prstGeom>
-                  </pic:spPr>
-                </pic:pic>
-              </a:graphicData>
-            </a:graphic>
-          </wp:anchor>
-        </w:drawing>
+        <mc:AlternateContent>
+          <mc:Choice Requires="wps">
+            <w:drawing>
+              <wp:anchor behindDoc="0" distT="0" distB="0" distL="0" distR="0" simplePos="0" locked="0" layoutInCell="0" allowOverlap="1" relativeHeight="2">
+                <wp:simplePos x="0" y="0"/>
+                <wp:positionH relativeFrom="column">
+                  <wp:posOffset>-972185</wp:posOffset>
+                </wp:positionH>
+                <wp:positionV relativeFrom="paragraph">
+                  <wp:posOffset>3634105</wp:posOffset>
+                </wp:positionV>
+                <wp:extent cx="7965440" cy="2000250"/>
+                <wp:effectExtent l="0" t="2982595" r="0" b="2982595"/>
+                <wp:wrapSquare wrapText="largest"/>
+                <wp:docPr id="1" name="Image1"/>
+                <a:graphic xmlns:a="http://schemas.openxmlformats.org/drawingml/2006/main">
+                  <a:graphicData uri="http://schemas.openxmlformats.org/drawingml/2006/picture">
+                    <pic:pic xmlns:pic="http://schemas.openxmlformats.org/drawingml/2006/picture">
+                      <pic:nvPicPr>
+                        <pic:cNvPr id="2" name="Image1" descr=""/>
+                        <pic:cNvPicPr/>
+                      </pic:nvPicPr>
+                      <pic:blipFill>
+                        <a:blip r:embed="rId2"/>
+                        <a:stretch/>
+                      </pic:blipFill>
+                      <pic:spPr>
+                        <a:xfrm rot="16200000">
+                          <a:off x="0" y="0"/>
+                          <a:ext cx="7965360" cy="2000160"/>
+                        </a:xfrm>
+                        <a:prstGeom prst="rect">
+                          <a:avLst/>
+                        </a:prstGeom>
+                        <a:ln w="0">
+                          <a:noFill/>
+                        </a:ln>
+                      </pic:spPr>
+                    </pic:pic>
+                  </a:graphicData>
+                </a:graphic>
+              </wp:anchor>
+            </w:drawing>
+          </mc:Choice>
+          <mc:Fallback>
+            <w:pict>
+              <v:shapetype id="_x0000_t75" coordsize="21600,21600" o:spt="75" o:preferrelative="t" path="m@4@5l@4@11@9@11@9@5xe" filled="f" stroked="f">
+                <v:stroke joinstyle="miter"/>
+                <v:formulas>
+                  <v:f eqn="if lineDrawn pixelLineWidth 0"/>
+                  <v:f eqn="sum @0 1 0"/>
+                  <v:f eqn="sum 0 0 @1"/>
+                  <v:f eqn="prod @2 1 2"/>
+                  <v:f eqn="prod @3 21600 pixelWidth"/>
+                  <v:f eqn="prod @3 21600 pixelHeight"/>
+                  <v:f eqn="sum @0 0 1"/>
+                  <v:f eqn="prod @6 1 2"/>
+                  <v:f eqn="prod @7 21600 pixelWidth"/>
+                  <v:f eqn="sum @8 21600 0"/>
+                  <v:f eqn="prod @7 21600 pixelHeight"/>
+                  <v:f eqn="sum @10 21600 0"/>
+                </v:formulas>
+                <v:path o:extrusionok="f" gradientshapeok="t" o:connecttype="rect"/>
+                <o:lock v:ext="edit" aspectratio="t"/>
+              </v:shapetype>
+              <v:shape id="shape_0" ID="Image1" stroked="f" o:allowincell="f" style="position:absolute;margin-left:-76.6pt;margin-top:286.15pt;width:627.15pt;height:157.45pt;mso-wrap-style:none;v-text-anchor:middle;rotation:270" type="_x0000_t75">
+                <v:imagedata r:id="rId3" o:detectmouseclick="t"/>
+                <v:stroke color="#3465a4" joinstyle="round" endcap="flat"/>
+                <w10:wrap type="square" side="largest"/>
+              </v:shape>
+            </w:pict>
+          </mc:Fallback>
+        </mc:AlternateContent>
       </w:r>
       <w:r>
         <w:br w:type="page"/>
@@ -2089,7 +2213,7 @@
         <w:rPr/>
         <w:t xml:space="preserve">The following function from file </w:t>
       </w:r>
-      <w:hyperlink r:id="rId3">
+      <w:hyperlink r:id="rId4">
         <w:r>
           <w:rPr>
             <w:rStyle w:val="Hyperlink"/>
@@ -2103,7 +2227,7 @@
         <w:rPr/>
         <w:t xml:space="preserve"> in Athena </w:t>
       </w:r>
-      <w:hyperlink r:id="rId4">
+      <w:hyperlink r:id="rId5">
         <w:r>
           <w:rPr>
             <w:rStyle w:val="Hyperlink"/>
@@ -2565,7 +2689,7 @@
         <w:rPr/>
         <w:t xml:space="preserve"> in file </w:t>
       </w:r>
-      <w:hyperlink r:id="rId5">
+      <w:hyperlink r:id="rId6">
         <w:r>
           <w:rPr>
             <w:rStyle w:val="Hyperlink"/>
@@ -2579,7 +2703,7 @@
         <w:rPr/>
         <w:t xml:space="preserve"> in Athena </w:t>
       </w:r>
-      <w:hyperlink r:id="rId6">
+      <w:hyperlink r:id="rId7">
         <w:r>
           <w:rPr>
             <w:rStyle w:val="Hyperlink"/>
@@ -4313,7 +4437,7 @@
         <w:pStyle w:val="BodyText"/>
         <w:widowControl/>
         <w:suppressAutoHyphens w:val="true"/>
-        <w:overflowPunct w:val="true"/>
+        <w:overflowPunct w:val="false"/>
         <w:bidi w:val="0"/>
         <w:rPr/>
       </w:pPr>
@@ -4334,7 +4458,7 @@
         <w:pStyle w:val="BodyText"/>
         <w:widowControl/>
         <w:suppressAutoHyphens w:val="true"/>
-        <w:overflowPunct w:val="true"/>
+        <w:overflowPunct w:val="false"/>
         <w:bidi w:val="0"/>
         <w:rPr/>
       </w:pPr>
@@ -4367,7 +4491,7 @@
         <w:pStyle w:val="BodyText"/>
         <w:widowControl/>
         <w:suppressAutoHyphens w:val="true"/>
-        <w:overflowPunct w:val="true"/>
+        <w:overflowPunct w:val="false"/>
         <w:bidi w:val="0"/>
         <w:rPr>
           <w:rFonts w:ascii="Liberation Serif;Times New Roman" w:hAnsi="Liberation Serif;Times New Roman" w:eastAsia="Noto Serif CJK SC" w:cs="Noto Sans Devanagari"/>
@@ -4395,7 +4519,7 @@
         <w:pStyle w:val="BodyText"/>
         <w:widowControl/>
         <w:suppressAutoHyphens w:val="true"/>
-        <w:overflowPunct w:val="true"/>
+        <w:overflowPunct w:val="false"/>
         <w:bidi w:val="0"/>
         <w:rPr>
           <w:rFonts w:ascii="Liberation Serif;Times New Roman" w:hAnsi="Liberation Serif;Times New Roman" w:eastAsia="Noto Serif CJK SC" w:cs="Noto Sans Devanagari"/>
@@ -5145,7 +5269,7 @@
         <w:pStyle w:val="BodyText"/>
         <w:widowControl/>
         <w:suppressAutoHyphens w:val="true"/>
-        <w:overflowPunct w:val="true"/>
+        <w:overflowPunct w:val="false"/>
         <w:bidi w:val="0"/>
         <w:spacing w:lineRule="auto" w:line="240" w:before="0" w:after="0"/>
         <w:jc w:val="start"/>
@@ -6193,7 +6317,7 @@
         <w:pStyle w:val="BodyText"/>
         <w:widowControl/>
         <w:suppressAutoHyphens w:val="true"/>
-        <w:overflowPunct w:val="true"/>
+        <w:overflowPunct w:val="false"/>
         <w:bidi w:val="0"/>
         <w:spacing w:lineRule="auto" w:line="240" w:before="0" w:after="0"/>
         <w:jc w:val="start"/>
@@ -6238,7 +6362,7 @@
         <w:pStyle w:val="BodyText"/>
         <w:widowControl/>
         <w:suppressAutoHyphens w:val="true"/>
-        <w:overflowPunct w:val="true"/>
+        <w:overflowPunct w:val="false"/>
         <w:bidi w:val="0"/>
         <w:spacing w:lineRule="auto" w:line="240" w:before="0" w:after="0"/>
         <w:jc w:val="start"/>
@@ -6279,7 +6403,7 @@
         <w:pStyle w:val="BodyText"/>
         <w:widowControl/>
         <w:suppressAutoHyphens w:val="true"/>
-        <w:overflowPunct w:val="true"/>
+        <w:overflowPunct w:val="false"/>
         <w:bidi w:val="0"/>
         <w:spacing w:lineRule="auto" w:line="240" w:before="0" w:after="0"/>
         <w:jc w:val="start"/>
@@ -6327,7 +6451,7 @@
         <w:pStyle w:val="BodyText"/>
         <w:widowControl/>
         <w:suppressAutoHyphens w:val="true"/>
-        <w:overflowPunct w:val="true"/>
+        <w:overflowPunct w:val="false"/>
         <w:bidi w:val="0"/>
         <w:spacing w:lineRule="auto" w:line="240" w:before="0" w:after="0"/>
         <w:jc w:val="start"/>
@@ -11391,7 +11515,7 @@
         <w:rPr/>
         <w:t xml:space="preserve">The CAPEC XML schema is described on </w:t>
       </w:r>
-      <w:hyperlink r:id="rId7">
+      <w:hyperlink r:id="rId8">
         <w:r>
           <w:rPr>
             <w:rStyle w:val="Hyperlink"/>
@@ -11526,24 +11650,7 @@
           <w:szCs w:val="18"/>
           <w:shd w:fill="auto" w:val="clear"/>
         </w:rPr>
-        <w:t xml:space="preserve">.../@Abstraction → rename to </w:t>
-      </w:r>
-      <w:r>
-        <w:rPr>
-          <w:rFonts w:cs="DejaVu Sans Mono" w:ascii="DejaVu Sans Mono" w:hAnsi="DejaVu Sans Mono"/>
-          <w:sz w:val="18"/>
-          <w:szCs w:val="18"/>
-          <w:shd w:fill="auto" w:val="clear"/>
-        </w:rPr>
-        <w:t>abstraction</w:t>
-      </w:r>
-      <w:r>
-        <w:rPr>
-          <w:rFonts w:cs="DejaVu Sans Mono" w:ascii="DejaVu Sans Mono" w:hAnsi="DejaVu Sans Mono"/>
-          <w:sz w:val="18"/>
-          <w:szCs w:val="18"/>
-          <w:shd w:fill="auto" w:val="clear"/>
-        </w:rPr>
+        <w:t>.../@Abstraction → rename to abstraction</w:t>
         <w:tab/>
         <w:t>string, “Detailed” or “Standard” or “Meta”</w:t>
       </w:r>
@@ -14479,7 +14586,7 @@
         <w:rPr/>
         <w:t xml:space="preserve">The KEV dataset is available at </w:t>
       </w:r>
-      <w:hyperlink r:id="rId8">
+      <w:hyperlink r:id="rId9">
         <w:r>
           <w:rPr>
             <w:rStyle w:val="Hyperlink"/>
@@ -14491,7 +14598,7 @@
         <w:rPr/>
         <w:t xml:space="preserve">. All KEVs are packaged in </w:t>
       </w:r>
-      <w:hyperlink r:id="rId9">
+      <w:hyperlink r:id="rId10">
         <w:r>
           <w:rPr>
             <w:rStyle w:val="Hyperlink"/>
@@ -14503,7 +14610,7 @@
         <w:rPr/>
         <w:t xml:space="preserve">. The JSON schema is described </w:t>
       </w:r>
-      <w:hyperlink r:id="rId10">
+      <w:hyperlink r:id="rId11">
         <w:r>
           <w:rPr>
             <w:rStyle w:val="Hyperlink"/>
@@ -14585,7 +14692,7 @@
         <w:pStyle w:val="BodyText"/>
         <w:widowControl/>
         <w:suppressAutoHyphens w:val="true"/>
-        <w:overflowPunct w:val="true"/>
+        <w:overflowPunct w:val="false"/>
         <w:bidi w:val="0"/>
         <w:spacing w:lineRule="auto" w:line="240" w:before="0" w:after="0"/>
         <w:ind w:end="-89"/>
@@ -14616,7 +14723,7 @@
         <w:pStyle w:val="BodyText"/>
         <w:widowControl/>
         <w:suppressAutoHyphens w:val="true"/>
-        <w:overflowPunct w:val="true"/>
+        <w:overflowPunct w:val="false"/>
         <w:bidi w:val="0"/>
         <w:spacing w:lineRule="auto" w:line="240" w:before="0" w:after="0"/>
         <w:ind w:end="-89"/>
@@ -14652,7 +14759,7 @@
         <w:pStyle w:val="BodyText"/>
         <w:widowControl/>
         <w:suppressAutoHyphens w:val="true"/>
-        <w:overflowPunct w:val="true"/>
+        <w:overflowPunct w:val="false"/>
         <w:bidi w:val="0"/>
         <w:spacing w:lineRule="auto" w:line="240" w:before="0" w:after="0"/>
         <w:ind w:end="-89"/>
@@ -14687,7 +14794,7 @@
         <w:pStyle w:val="BodyText"/>
         <w:widowControl/>
         <w:suppressAutoHyphens w:val="true"/>
-        <w:overflowPunct w:val="true"/>
+        <w:overflowPunct w:val="false"/>
         <w:bidi w:val="0"/>
         <w:spacing w:lineRule="auto" w:line="240" w:before="0" w:after="0"/>
         <w:ind w:end="-89"/>
@@ -14723,7 +14830,7 @@
         <w:pStyle w:val="BodyText"/>
         <w:widowControl/>
         <w:suppressAutoHyphens w:val="true"/>
-        <w:overflowPunct w:val="true"/>
+        <w:overflowPunct w:val="false"/>
         <w:bidi w:val="0"/>
         <w:spacing w:lineRule="auto" w:line="240" w:before="0" w:after="0"/>
         <w:ind w:end="-89"/>
@@ -14757,7 +14864,7 @@
         <w:pStyle w:val="BodyText"/>
         <w:widowControl/>
         <w:suppressAutoHyphens w:val="true"/>
-        <w:overflowPunct w:val="true"/>
+        <w:overflowPunct w:val="false"/>
         <w:bidi w:val="0"/>
         <w:spacing w:lineRule="auto" w:line="240" w:before="0" w:after="0"/>
         <w:ind w:end="-89"/>
@@ -14793,7 +14900,7 @@
         <w:pStyle w:val="BodyText"/>
         <w:widowControl/>
         <w:suppressAutoHyphens w:val="true"/>
-        <w:overflowPunct w:val="true"/>
+        <w:overflowPunct w:val="false"/>
         <w:bidi w:val="0"/>
         <w:spacing w:lineRule="auto" w:line="240" w:before="0" w:after="0"/>
         <w:ind w:end="-89"/>
@@ -14828,7 +14935,7 @@
         <w:pStyle w:val="BodyText"/>
         <w:widowControl/>
         <w:suppressAutoHyphens w:val="true"/>
-        <w:overflowPunct w:val="true"/>
+        <w:overflowPunct w:val="false"/>
         <w:bidi w:val="0"/>
         <w:spacing w:lineRule="auto" w:line="240" w:before="0" w:after="0"/>
         <w:ind w:end="-89"/>
@@ -14863,7 +14970,7 @@
         <w:pStyle w:val="BodyText"/>
         <w:widowControl/>
         <w:suppressAutoHyphens w:val="true"/>
-        <w:overflowPunct w:val="true"/>
+        <w:overflowPunct w:val="false"/>
         <w:bidi w:val="0"/>
         <w:spacing w:lineRule="auto" w:line="240" w:before="0" w:after="0"/>
         <w:ind w:end="-89"/>
@@ -14899,7 +15006,7 @@
         <w:pStyle w:val="BodyText"/>
         <w:widowControl/>
         <w:suppressAutoHyphens w:val="true"/>
-        <w:overflowPunct w:val="true"/>
+        <w:overflowPunct w:val="false"/>
         <w:bidi w:val="0"/>
         <w:spacing w:lineRule="auto" w:line="240" w:before="0" w:after="0"/>
         <w:ind w:end="-89"/>
@@ -14932,7 +15039,7 @@
         <w:pStyle w:val="BodyText"/>
         <w:widowControl/>
         <w:suppressAutoHyphens w:val="true"/>
-        <w:overflowPunct w:val="true"/>
+        <w:overflowPunct w:val="false"/>
         <w:bidi w:val="0"/>
         <w:spacing w:lineRule="auto" w:line="240" w:before="0" w:after="0"/>
         <w:ind w:end="-89"/>
@@ -14968,7 +15075,7 @@
         <w:pStyle w:val="BodyText"/>
         <w:widowControl/>
         <w:suppressAutoHyphens w:val="true"/>
-        <w:overflowPunct w:val="true"/>
+        <w:overflowPunct w:val="false"/>
         <w:bidi w:val="0"/>
         <w:spacing w:lineRule="auto" w:line="240" w:before="0" w:after="0"/>
         <w:ind w:end="-89"/>
@@ -15004,7 +15111,7 @@
         <w:pStyle w:val="BodyText"/>
         <w:widowControl/>
         <w:suppressAutoHyphens w:val="true"/>
-        <w:overflowPunct w:val="true"/>
+        <w:overflowPunct w:val="false"/>
         <w:bidi w:val="0"/>
         <w:spacing w:lineRule="auto" w:line="240" w:before="0" w:after="0"/>
         <w:ind w:end="-89"/>
@@ -15070,7 +15177,7 @@
         <w:pStyle w:val="BodyText"/>
         <w:widowControl/>
         <w:suppressAutoHyphens w:val="true"/>
-        <w:overflowPunct w:val="true"/>
+        <w:overflowPunct w:val="false"/>
         <w:bidi w:val="0"/>
         <w:spacing w:lineRule="auto" w:line="240" w:before="0" w:after="0"/>
         <w:ind w:end="-89"/>
@@ -15122,7 +15229,7 @@
         <w:pStyle w:val="BodyText"/>
         <w:widowControl/>
         <w:suppressAutoHyphens w:val="true"/>
-        <w:overflowPunct w:val="true"/>
+        <w:overflowPunct w:val="false"/>
         <w:bidi w:val="0"/>
         <w:spacing w:lineRule="auto" w:line="240" w:before="0" w:after="0"/>
         <w:ind w:end="-89"/>
@@ -15156,7 +15263,7 @@
         <w:pStyle w:val="BodyText"/>
         <w:widowControl/>
         <w:suppressAutoHyphens w:val="true"/>
-        <w:overflowPunct w:val="true"/>
+        <w:overflowPunct w:val="false"/>
         <w:bidi w:val="0"/>
         <w:spacing w:lineRule="auto" w:line="240" w:before="0" w:after="0"/>
         <w:ind w:end="-89"/>
@@ -15217,11 +15324,7 @@
       </w:pPr>
       <w:r>
         <w:rPr/>
-        <w:t xml:space="preserve">EPSS </w:t>
-      </w:r>
-      <w:r>
-        <w:rPr/>
-        <w:t>Schema</w:t>
+        <w:t>EPSS Schema</w:t>
       </w:r>
     </w:p>
     <w:p>
@@ -15234,7 +15337,7 @@
         <w:rPr/>
         <w:t>The Exploit Prediction Scoring System (</w:t>
       </w:r>
-      <w:hyperlink r:id="rId11">
+      <w:hyperlink r:id="rId12">
         <w:r>
           <w:rPr>
             <w:rStyle w:val="Hyperlink"/>
@@ -15278,7 +15381,7 @@
         <w:rPr/>
         <w:t xml:space="preserve">The EPSS </w:t>
       </w:r>
-      <w:hyperlink r:id="rId12">
+      <w:hyperlink r:id="rId13">
         <w:r>
           <w:rPr>
             <w:rStyle w:val="Hyperlink"/>
@@ -15290,7 +15393,7 @@
         <w:rPr/>
         <w:t xml:space="preserve"> and </w:t>
       </w:r>
-      <w:hyperlink r:id="rId13">
+      <w:hyperlink r:id="rId14">
         <w:r>
           <w:rPr>
             <w:rStyle w:val="Hyperlink"/>
@@ -15325,11 +15428,7 @@
       </w:pPr>
       <w:r>
         <w:rPr/>
-        <w:t xml:space="preserve">EPSS </w:t>
-      </w:r>
-      <w:r>
-        <w:rPr/>
-        <w:t>Nodes and Properties</w:t>
+        <w:t>EPSS Nodes and Properties</w:t>
       </w:r>
     </w:p>
     <w:p>
@@ -15367,7 +15466,7 @@
         <w:pStyle w:val="BodyText"/>
         <w:widowControl/>
         <w:suppressAutoHyphens w:val="true"/>
-        <w:overflowPunct w:val="true"/>
+        <w:overflowPunct w:val="false"/>
         <w:bidi w:val="0"/>
         <w:spacing w:lineRule="auto" w:line="240" w:before="0" w:after="0"/>
         <w:ind w:end="-89"/>
@@ -15398,7 +15497,7 @@
         <w:pStyle w:val="BodyText"/>
         <w:widowControl/>
         <w:suppressAutoHyphens w:val="true"/>
-        <w:overflowPunct w:val="true"/>
+        <w:overflowPunct w:val="false"/>
         <w:bidi w:val="0"/>
         <w:spacing w:lineRule="auto" w:line="240" w:before="0" w:after="0"/>
         <w:ind w:end="-89"/>
@@ -15435,7 +15534,7 @@
         <w:pStyle w:val="BodyText"/>
         <w:widowControl/>
         <w:suppressAutoHyphens w:val="true"/>
-        <w:overflowPunct w:val="true"/>
+        <w:overflowPunct w:val="false"/>
         <w:bidi w:val="0"/>
         <w:spacing w:lineRule="auto" w:line="240" w:before="0" w:after="0"/>
         <w:ind w:end="-89"/>
@@ -15472,7 +15571,7 @@
         <w:pStyle w:val="BodyText"/>
         <w:widowControl/>
         <w:suppressAutoHyphens w:val="true"/>
-        <w:overflowPunct w:val="true"/>
+        <w:overflowPunct w:val="false"/>
         <w:bidi w:val="0"/>
         <w:spacing w:lineRule="auto" w:line="240" w:before="0" w:after="0"/>
         <w:ind w:end="-89"/>
@@ -15508,7 +15607,7 @@
         <w:pStyle w:val="BodyText"/>
         <w:widowControl/>
         <w:suppressAutoHyphens w:val="true"/>
-        <w:overflowPunct w:val="true"/>
+        <w:overflowPunct w:val="false"/>
         <w:bidi w:val="0"/>
         <w:spacing w:lineRule="auto" w:line="240" w:before="0" w:after="0"/>
         <w:ind w:end="-89"/>
@@ -15545,7 +15644,7 @@
         <w:pStyle w:val="BodyText"/>
         <w:widowControl/>
         <w:suppressAutoHyphens w:val="true"/>
-        <w:overflowPunct w:val="true"/>
+        <w:overflowPunct w:val="false"/>
         <w:bidi w:val="0"/>
         <w:spacing w:lineRule="auto" w:line="240" w:before="0" w:after="0"/>
         <w:ind w:end="-89"/>
@@ -15560,7 +15659,14 @@
         </w:rPr>
       </w:pPr>
       <w:r>
-        <w:rPr/>
+        <w:rPr>
+          <w:rFonts w:eastAsia="Noto Serif CJK SC" w:cs="DejaVu Sans Mono" w:ascii="DejaVu Sans Mono" w:hAnsi="DejaVu Sans Mono"/>
+          <w:color w:val="auto"/>
+          <w:kern w:val="2"/>
+          <w:sz w:val="20"/>
+          <w:szCs w:val="20"/>
+          <w:lang w:val="en-US" w:eastAsia="zh-CN" w:bidi="hi-IN"/>
+        </w:rPr>
       </w:r>
     </w:p>
     <w:p>
@@ -15568,7 +15674,7 @@
         <w:pStyle w:val="BodyText"/>
         <w:widowControl/>
         <w:suppressAutoHyphens w:val="true"/>
-        <w:overflowPunct w:val="true"/>
+        <w:overflowPunct w:val="false"/>
         <w:bidi w:val="0"/>
         <w:spacing w:lineRule="auto" w:line="240" w:before="0" w:after="0"/>
         <w:ind w:end="-89"/>
@@ -15612,7 +15718,14 @@
         </w:rPr>
       </w:pPr>
       <w:r>
-        <w:rPr/>
+        <w:rPr>
+          <w:rFonts w:eastAsia="Noto Serif CJK SC" w:cs="DejaVu Sans Mono" w:ascii="DejaVu Sans Mono" w:hAnsi="DejaVu Sans Mono"/>
+          <w:color w:val="auto"/>
+          <w:kern w:val="2"/>
+          <w:sz w:val="20"/>
+          <w:szCs w:val="20"/>
+          <w:lang w:val="en-US" w:eastAsia="zh-CN" w:bidi="hi-IN"/>
+        </w:rPr>
       </w:r>
     </w:p>
     <w:p>
@@ -15634,11 +15747,7 @@
       </w:pPr>
       <w:r>
         <w:rPr/>
-        <w:t xml:space="preserve">EPSS </w:t>
-      </w:r>
-      <w:r>
-        <w:rPr/>
-        <w:t>Edges</w:t>
+        <w:t>EPSS Edges</w:t>
       </w:r>
     </w:p>
     <w:p>
@@ -15646,7 +15755,7 @@
         <w:pStyle w:val="BodyText"/>
         <w:widowControl/>
         <w:suppressAutoHyphens w:val="true"/>
-        <w:overflowPunct w:val="true"/>
+        <w:overflowPunct w:val="false"/>
         <w:bidi w:val="0"/>
         <w:spacing w:lineRule="auto" w:line="240" w:before="0" w:after="0"/>
         <w:ind w:end="-89"/>
@@ -15662,15 +15771,7 @@
       </w:pPr>
       <w:r>
         <w:rPr/>
-        <w:t>EPSS</w:t>
-      </w:r>
-      <w:r>
-        <w:rPr/>
-        <w:t xml:space="preserve"> - [:</w:t>
-      </w:r>
-      <w:r>
-        <w:rPr/>
-        <w:t>scores] -&gt; CVE</w:t>
+        <w:t>EPSS - [:scores] -&gt; CVE</w:t>
         <w:tab/>
         <w:tab/>
       </w:r>
@@ -15691,7 +15792,7 @@
         <w:pStyle w:val="BodyText"/>
         <w:widowControl/>
         <w:suppressAutoHyphens w:val="true"/>
-        <w:overflowPunct w:val="true"/>
+        <w:overflowPunct w:val="false"/>
         <w:bidi w:val="0"/>
         <w:spacing w:lineRule="auto" w:line="240" w:before="0" w:after="0"/>
         <w:ind w:end="-89"/>
@@ -15706,7 +15807,14 @@
         </w:rPr>
       </w:pPr>
       <w:r>
-        <w:rPr/>
+        <w:rPr>
+          <w:rFonts w:eastAsia="Noto Serif CJK SC" w:cs="DejaVu Sans Mono" w:ascii="DejaVu Sans Mono" w:hAnsi="DejaVu Sans Mono"/>
+          <w:color w:val="auto"/>
+          <w:kern w:val="2"/>
+          <w:sz w:val="20"/>
+          <w:szCs w:val="20"/>
+          <w:lang w:val="en-US" w:eastAsia="zh-CN" w:bidi="hi-IN"/>
+        </w:rPr>
       </w:r>
     </w:p>
     <w:p>
@@ -15714,7 +15822,7 @@
         <w:pStyle w:val="BodyText"/>
         <w:widowControl/>
         <w:suppressAutoHyphens w:val="true"/>
-        <w:overflowPunct w:val="true"/>
+        <w:overflowPunct w:val="false"/>
         <w:bidi w:val="0"/>
         <w:spacing w:lineRule="auto" w:line="240" w:before="0" w:after="0"/>
         <w:ind w:end="-89"/>
@@ -15729,7 +15837,14 @@
         </w:rPr>
       </w:pPr>
       <w:r>
-        <w:rPr/>
+        <w:rPr>
+          <w:rFonts w:eastAsia="Noto Serif CJK SC" w:cs="DejaVu Sans Mono" w:ascii="DejaVu Sans Mono" w:hAnsi="DejaVu Sans Mono"/>
+          <w:color w:val="auto"/>
+          <w:kern w:val="2"/>
+          <w:sz w:val="20"/>
+          <w:szCs w:val="20"/>
+          <w:lang w:val="en-US" w:eastAsia="zh-CN" w:bidi="hi-IN"/>
+        </w:rPr>
       </w:r>
     </w:p>
     <w:sectPr>
@@ -15750,7 +15865,7 @@
   <w:comment w:id="0" w:author="I.C." w:date="2026-02-20T20:32:28Z" w:initials="I">
     <w:p>
       <w:pPr>
-        <w:overflowPunct w:val="false"/>
+        <w:overflowPunct w:val="true"/>
         <w:rPr/>
       </w:pPr>
       <w:r>
@@ -15764,7 +15879,7 @@
     </w:p>
     <w:p>
       <w:pPr>
-        <w:overflowPunct w:val="false"/>
+        <w:overflowPunct w:val="true"/>
         <w:rPr/>
       </w:pPr>
       <w:r>
@@ -16201,7 +16316,7 @@
     <w:pPr>
       <w:widowControl/>
       <w:suppressAutoHyphens w:val="true"/>
-      <w:overflowPunct w:val="true"/>
+      <w:overflowPunct w:val="false"/>
       <w:bidi w:val="0"/>
       <w:spacing w:before="0" w:after="0"/>
       <w:jc w:val="start"/>

</xml_diff>